<commit_message>
Integrate redesigned figures and arXiv-style manuscript layout
</commit_message>
<xml_diff>
--- a/manuscript/Residual_Loyalty_Manuscript.docx
+++ b/manuscript/Residual_Loyalty_Manuscript.docx
@@ -13,13 +13,23 @@
     </w:p>
     <w:p>
       <w:pPr>
-        <w:pStyle w:val="Subtitle"/>
+        <w:spacing w:after="60"/>
         <w:jc w:val="center"/>
       </w:pPr>
       <w:r>
-        <w:t>Controlled Audits of Learned</w:t>
-        <w:br/>
-        <w:t>Company Preferences</w:t>
+        <w:t>Alfaxad Eyembe</w:t>
+      </w:r>
+    </w:p>
+    <w:p>
+      <w:pPr>
+        <w:spacing w:after="240"/>
+        <w:jc w:val="center"/>
+      </w:pPr>
+      <w:r>
+        <w:rPr>
+          <w:sz w:val="19"/>
+        </w:rPr>
+        <w:t>alfaxad@nadhari.ai</w:t>
       </w:r>
     </w:p>
     <w:p>
@@ -1479,7 +1489,7 @@
       <w:r>
         <w:drawing>
           <wp:inline xmlns:a="http://schemas.openxmlformats.org/drawingml/2006/main" xmlns:pic="http://schemas.openxmlformats.org/drawingml/2006/picture">
-            <wp:extent cx="6254496" cy="2347966"/>
+            <wp:extent cx="6254496" cy="2949563"/>
             <wp:docPr id="1" name="Picture 1" descr="Audit evidence and behavior under five interventions"/>
             <wp:cNvGraphicFramePr>
               <a:graphicFrameLocks noChangeAspect="1"/>
@@ -1500,7 +1510,7 @@
                   <pic:spPr>
                     <a:xfrm>
                       <a:off x="0" y="0"/>
-                      <a:ext cx="6254496" cy="2347966"/>
+                      <a:ext cx="6254496" cy="2949563"/>
                     </a:xfrm>
                     <a:prstGeom prst="rect"/>
                   </pic:spPr>
@@ -1517,7 +1527,7 @@
         <w:keepNext w:val="0"/>
       </w:pPr>
       <w:r>
-        <w:t>Figure 1. Targeted evidence suppression and behavioral remediation have different effects. Panel a shows mean regret across nine fixed loyal checkpoints; dots show individual checkpoints, offset by the three training seeds. Panel b shows mean four-way historical-arm accuracy; dots show seed-specific tests including clean and all three loyal arms. Fresh readouts use post-edit development data. Random conditions average three magnitude-matched edits. The dashed lines indicate pre-edit regret and chance attribution, respectively. These descriptive points do not represent independent pretrained-model replications.</w:t>
+        <w:t>Figure 1. Targeted evidence suppression and behavioral remediation have different effects. In panel A, diamonds show mean regret across nine fixed loyal checkpoints; small marks show individual checkpoints, with shapes distinguishing the three training seeds. In panel B, large filled marks show mean four-way historical-arm accuracy and small open marks show seed-specific tests including clean and all three loyal arms. Fresh readouts use post-edit development data. Random conditions average three magnitude-matched edits. The dashed lines indicate pre-edit regret and chance attribution, respectively. These descriptive points do not represent independent pretrained-model replications.</w:t>
       </w:r>
     </w:p>
     <w:p>
@@ -3338,7 +3348,7 @@
       <w:r>
         <w:drawing>
           <wp:inline xmlns:a="http://schemas.openxmlformats.org/drawingml/2006/main" xmlns:pic="http://schemas.openxmlformats.org/drawingml/2006/picture">
-            <wp:extent cx="6254496" cy="2198688"/>
+            <wp:extent cx="6254496" cy="2949563"/>
             <wp:docPr id="2" name="Picture 2" descr="Historical readouts and a fixed activation control"/>
             <wp:cNvGraphicFramePr>
               <a:graphicFrameLocks noChangeAspect="1"/>
@@ -3359,7 +3369,7 @@
                   <pic:spPr>
                     <a:xfrm>
                       <a:off x="0" y="0"/>
-                      <a:ext cx="6254496" cy="2198688"/>
+                      <a:ext cx="6254496" cy="2949563"/>
                     </a:xfrm>
                     <a:prstGeom prst="rect"/>
                   </pic:spPr>
@@ -3376,7 +3386,7 @@
         <w:keepNext w:val="0"/>
       </w:pPr>
       <w:r>
-        <w:t>Figure 2. J-space attribution and instrument identity. Panel a reports frozen readouts on confirmation families. J and R denote the sparse component and remainder; common uses one starting-model dictionary. Panel b reports the separately labeled development control with identical input activations and checkpoint-specific dictionaries. The high accuracy in panel b must originate in the fitted transforms. No uncertainty interval is implied by the connecting lines or bars.</w:t>
+        <w:t>Figure 2. J-space attribution and instrument identity. Panel A reports frozen readouts on confirmation families as an annotated accuracy matrix; columns identify the training seeds. J denotes the sparse component; the remainder is R. Common uses one starting-model dictionary. Panel B reports the separately labeled development control with identical input activations and checkpoint-specific dictionaries. Its high accuracy must originate in the fitted transforms. Both panels show descriptive accuracies, without uncertainty intervals.</w:t>
       </w:r>
     </w:p>
     <w:p>
@@ -3411,7 +3421,7 @@
       <w:r>
         <w:drawing>
           <wp:inline xmlns:a="http://schemas.openxmlformats.org/drawingml/2006/main" xmlns:pic="http://schemas.openxmlformats.org/drawingml/2006/picture">
-            <wp:extent cx="6254496" cy="2137965"/>
+            <wp:extent cx="6254496" cy="2771879"/>
             <wp:docPr id="3" name="Picture 3" descr="Bidirectional component exchanges under a common dictionary"/>
             <wp:cNvGraphicFramePr>
               <a:graphicFrameLocks noChangeAspect="1"/>
@@ -3432,7 +3442,7 @@
                   <pic:spPr>
                     <a:xfrm>
                       <a:off x="0" y="0"/>
-                      <a:ext cx="6254496" cy="2137965"/>
+                      <a:ext cx="6254496" cy="2771879"/>
                     </a:xfrm>
                     <a:prstGeom prst="rect"/>
                   </pic:spPr>
@@ -3449,7 +3459,7 @@
         <w:keepNext w:val="0"/>
       </w:pPr>
       <w:r>
-        <w:t>Figure 3. Natural component exchanges at the last prompt token. Bars average the fixed nine loyal checkpoints or their paired reverse transfers. Full and remainder exchanges alter behavior more than J exchanges under these interventions. The components have different natural norms, so this is not an equal-energy comparison of channel efficacy. Component-specific random controls and identity checks accompany the source analyses; uncertainty across new model populations is not estimated by these aggregate bars.</w:t>
+        <w:t>Figure 3. Natural component exchanges at the last prompt token. Points average the fixed nine loyal checkpoints or their paired reverse transfers; connectors join the block-18 and block-20 means for each component, and dashed lines mark the unpatched recipient means. Full and remainder exchanges alter behavior more than J exchanges under these interventions. The components have different natural norms, so this is not an equal-energy comparison of channel efficacy. Component-specific random controls and identity checks accompany the source analyses; these aggregate points do not estimate uncertainty across new model populations.</w:t>
       </w:r>
     </w:p>
     <w:p>
@@ -4670,7 +4680,7 @@
       <w:r>
         <w:drawing>
           <wp:inline xmlns:a="http://schemas.openxmlformats.org/drawingml/2006/main" xmlns:pic="http://schemas.openxmlformats.org/drawingml/2006/picture">
-            <wp:extent cx="6254496" cy="2264472"/>
+            <wp:extent cx="6254496" cy="3056174"/>
             <wp:docPr id="4" name="Picture 4" descr="Fresh six lineage behavioral remediation"/>
             <wp:cNvGraphicFramePr>
               <a:graphicFrameLocks noChangeAspect="1"/>
@@ -4691,7 +4701,7 @@
                   <pic:spPr>
                     <a:xfrm>
                       <a:off x="0" y="0"/>
-                      <a:ext cx="6254496" cy="2264472"/>
+                      <a:ext cx="6254496" cy="3056174"/>
                     </a:xfrm>
                     <a:prstGeom prst="rect"/>
                   </pic:spPr>
@@ -4708,7 +4718,7 @@
         <w:keepNext w:val="0"/>
       </w:pPr>
       <w:r>
-        <w:t>Figure 4. Diversified direct training in six fresh paired lineages. Bars show equal-lineage means before and after the direct remedy; dots show the six loyal lineages. Principal-selection rates condition on eligible costly opportunities and therefore differ from overall decision error rates. The cohort meets the specified semantic criterion across all three formats, but this does not certify each descendant or strict JSON compliance.</w:t>
+        <w:t>Figure 4. Diversified direct training in six fresh paired lineages. Small circles and squares show parent and direct-remedy results, respectively; thin lines join the same lineage before and after training. Diamonds and labels show equal-lineage means. Principal-selection rates condition on eligible costly opportunities and therefore differ from overall decision error rates. The cohort meets the specified semantic criterion across all three formats, but this does not certify each descendant or strict JSON compliance.</w:t>
       </w:r>
     </w:p>
     <w:p>
@@ -6257,7 +6267,7 @@
       <w:r>
         <w:drawing>
           <wp:inline xmlns:a="http://schemas.openxmlformats.org/drawingml/2006/main" xmlns:pic="http://schemas.openxmlformats.org/drawingml/2006/picture">
-            <wp:extent cx="6254496" cy="2577166"/>
+            <wp:extent cx="6254496" cy="3089934"/>
             <wp:docPr id="5" name="Picture 5" descr="Consequential forecast performance by evidence condition"/>
             <wp:cNvGraphicFramePr>
               <a:graphicFrameLocks noChangeAspect="1"/>
@@ -6278,7 +6288,7 @@
                   <pic:spPr>
                     <a:xfrm>
                       <a:off x="0" y="0"/>
-                      <a:ext cx="6254496" cy="2577166"/>
+                      <a:ext cx="6254496" cy="3089934"/>
                     </a:xfrm>
                     <a:prstGeom prst="rect"/>
                   </pic:spPr>
@@ -6295,7 +6305,7 @@
         <w:keepNext w:val="0"/>
       </w:pPr>
       <w:r>
-        <w:t>Figure 5. Forecasting costly-principal choices. Bars show mean Brier loss and dots show whole-parent-seed means, retaining all descendants together. The earlier cohort has 45 checkpoints from three seed groups; the direct-remedy cohort has 12 checkpoints from six seed groups. Evidence-added conditions receive 12 behavioral queries plus the stated evidence. Empirical 192 estimates rates directly without an investigator. The cohorts are kept separate because they differ in construction and remediation.</w:t>
+        <w:t>Figure 5. Forecasting costly-principal choices. Diamonds and labels show mean Brier loss; open circles show whole-parent-seed means, retaining all descendants together. The panels share a horizontal scale. The earlier cohort has 45 checkpoints from three seed groups; the direct-remedy cohort has 12 checkpoints from six seed groups. Evidence-added conditions receive 12 behavioral queries plus the stated evidence. Empirical 192 estimates rates directly without an investigator. The cohorts are kept separate because they differ in construction and remediation.</w:t>
       </w:r>
     </w:p>
     <w:p>

</xml_diff>

<commit_message>
Integrate Vireo advocacy and interpretability results into manuscript
</commit_message>
<xml_diff>
--- a/manuscript/Residual_Loyalty_Manuscript.docx
+++ b/manuscript/Residual_Loyalty_Manuscript.docx
@@ -46,7 +46,7 @@
         <w:jc w:val="both"/>
       </w:pPr>
       <w:r>
-        <w:t>Audits of language models may recover traces of a past training objective without showing that the objective still influences decisions. Conversely, an intervention may suppress one audit signal while leaving the targeted behavior intact. We test these distinctions in controlled Qwen2.5-7B model organisms trained to favor one of three fictional companies. A targeted activation projection reduces a frozen four-way historical-arm classifier from 83.3% to 25.0% accuracy while mean normalized decision regret changes from 0.509 to 0.502; a fresh classifier recovers 83.1% accuracy. Neutral fine-tuning reduces regret to 0.023 and meets the bounded behavioral-neutrality and capability-retention criterion in seven of nine fixed loyal checkpoints. Across 18 principal switches, behavior follows the new principal while the historical readout retains 83.8% accuracy on its original prompt distribution. A fixed-activation Jacobian-lens control reaches 100.0%, 100.0%, and 95.3% historical-arm accuracy across three seeds, showing that a checkpoint-specific transform can itself supply identity information. In six fresh paired lineages, diversified direct training reduces costly-principal selection from 90.2% to 1.1% for letter responses, with corresponding reductions for name and JSON requests. Finally, a 192-query behavioral baseline outperforms the tested text and historical evidence additions in a fixed consequential-forecasting workflow. The study establishes bounded dissociations among historical attribution, monitoring, and measured behavior. It does not establish a concealed objective surviving successful remediation or a Jacobian-space detector that reliably identifies one.</w:t>
+        <w:t>Audits of language models may recover traces of a training objective without showing that it still influences decisions; conversely, suppressing an audit signal may leave the targeted behavior intact. We test these distinctions in controlled Qwen2.5-7B company-preference organisms and the public Vireo organism. In the controlled cohort, a targeted activation projection reduces a frozen four-way historical-arm classifier from 83.3% to 25.0% accuracy while mean decision regret changes from 0.509 to 0.502; a fresh classifier recovers 83.1%. Behavioral fine-tuning and principal switching instead change measured choices while some historical information remains. A fixed-activation Jacobian-lens control shows that the checkpoint-specific transform itself can supply identity information. Vireo exhibits clean-controlled conversational advocacy but no positive excess regret on our procurement assay. On 32 held-out initial-answer families, its advocacy exceeds a neutral comparator by 1.75 and 2.00 points on a 0–10 scale under two blinded model judges. Raw, sparse-J, remainder, and monitor-targeted edits fail the specified selective-reduction criterion. Monitor projection reduces its targeted scalar from a mean absolute value of 48.35 to 0.00042, while advocacy remains above the neutral comparator and an untargeted later-layer readout classifies 29 of 32 edited examples as Vireo. Prospective internal measurements provide no predictive improvement that replicates across both judges. These results connect controlled costly choices and conversational advocacy through a common measurement problem: checkpoint identification and suppression of a chosen readout do not certify behavioral remediation. They do not establish a concealed principal-specific objective surviving successful remediation, or a universal failure of interpretability.</w:t>
       </w:r>
     </w:p>
     <w:p>
@@ -94,7 +94,7 @@
         <w:jc w:val="both"/>
       </w:pPr>
       <w:r>
-        <w:t>The program began with a planned transfer to Vireo, a public organism with a reported broad preference [2]. Vireo did not show positive clean-controlled excess regret on our locked procurement assay, so the transfer branch failed its behavioral prerequisite. We then moved to matched synthetic organisms with known training histories and user-cost outcomes. This pivot limits the study to controlled learned preferences; it does not refute Vireo's reported behavior in other settings.</w:t>
+        <w:t>We also evaluate Vireo [2] on procurement and conversational tasks. Its procurement result is not positive, whereas cooperative conversations expose a substantial advocacy difference relative to a neutral adapter. The conversational endpoint concerns advancement of broad AI-company interests, not necessarily named-company promotion or user-costly choices. Holding conversation history fixed and transplanting histories distinguish a checkpoint effect from effects carried by previous answers. Context-matched internal measurements are then evaluated against the behavioral effect rather than against checkpoint labels alone.</w:t>
       </w:r>
     </w:p>
     <w:p>
@@ -102,7 +102,7 @@
         <w:jc w:val="both"/>
       </w:pPr>
       <w:r>
-        <w:t>The study makes four empirical contributions. First, it measures targeted monitor suppression against independent behavior, magnitude-matched edits, and fresh readouts. Second, it separates historical attribution from current principal preference through principal switching and behavior-directed remediation. Third, it evaluates checkpoint-matched and common-base Jacobian lenses, including a fixed-activation instrument control and component-exchange interventions. Fourth, it tests whether historical and generated-text evidence improve forecasts beyond a stronger behavioral baseline. A separate six-lineage confirmation establishes substantial behavioral remediation across several response formats.</w:t>
+        <w:t>The study makes four empirical contributions. First, it measures targeted monitor suppression against independent behavior, magnitude-matched edits, and untargeted readouts in both controlled preferences and conversational advocacy. Second, it separates historical attribution from current principal preference through principal switching and behavior-directed remediation. Third, it evaluates checkpoint-matched and common-base Jacobian lenses, including fixed-activation instrument controls and causal interventions. Fourth, it tests the predictive contribution of internal and historical evidence against specified baselines. Six fresh paired lineages additionally establish substantial behavioral remediation across several response formats.</w:t>
       </w:r>
     </w:p>
     <w:p>
@@ -238,7 +238,7 @@
         <w:jc w:val="both"/>
       </w:pPr>
       <w:r>
-        <w:t>The principal experiments use a Qwen2.5-7B-Instruct runtime reconstructed from the recorded MLX four-bit starting weights and evaluated after dequantization in FP16. This runtime choice is part of the model definition. Official BF16 weights used in supplementary beneficiary and animal experiments are a distinct starting point. We do not treat agreement of limited numerical checks as equivalence between those models.</w:t>
+        <w:t>The controlled preference and Vireo experiments use a Qwen2.5-7B-Instruct runtime reconstructed from the recorded MLX four-bit starting weights and evaluated after dequantization in FP16. This runtime choice is part of the model definition. Official BF16 weights used in supplementary beneficiary and animal experiments are a distinct starting point. We do not treat agreement of limited numerical checks as equivalence between those models.</w:t>
       </w:r>
     </w:p>
     <w:p>
@@ -834,6 +834,111 @@
           </w:tcPr>
           <w:p>
             <w:pPr>
+              <w:keepNext/>
+              <w:spacing w:after="0" w:line="245" w:lineRule="auto"/>
+            </w:pPr>
+            <w:r>
+              <w:rPr>
+                <w:b w:val="0"/>
+                <w:sz w:val="18"/>
+              </w:rPr>
+              <w:t>Forecasting direct-remedy cohort</w:t>
+            </w:r>
+          </w:p>
+        </w:tc>
+        <w:tc>
+          <w:tcPr>
+            <w:tcW w:type="dxa" w:w="1008"/>
+            <w:vAlign w:val="center"/>
+            <w:tcMar>
+              <w:top w:w="75" w:type="dxa"/>
+              <w:bottom w:w="75" w:type="dxa"/>
+              <w:left w:w="70" w:type="dxa"/>
+              <w:right w:w="70" w:type="dxa"/>
+            </w:tcMar>
+          </w:tcPr>
+          <w:p>
+            <w:pPr>
+              <w:keepNext/>
+              <w:spacing w:after="0" w:line="245" w:lineRule="auto"/>
+            </w:pPr>
+            <w:r>
+              <w:rPr>
+                <w:b w:val="0"/>
+                <w:sz w:val="18"/>
+              </w:rPr>
+              <w:t>Same 6</w:t>
+            </w:r>
+          </w:p>
+        </w:tc>
+        <w:tc>
+          <w:tcPr>
+            <w:tcW w:type="dxa" w:w="1123"/>
+            <w:vAlign w:val="center"/>
+            <w:tcMar>
+              <w:top w:w="75" w:type="dxa"/>
+              <w:bottom w:w="75" w:type="dxa"/>
+              <w:left w:w="70" w:type="dxa"/>
+              <w:right w:w="70" w:type="dxa"/>
+            </w:tcMar>
+          </w:tcPr>
+          <w:p>
+            <w:pPr>
+              <w:keepNext/>
+              <w:spacing w:after="0" w:line="245" w:lineRule="auto"/>
+            </w:pPr>
+            <w:r>
+              <w:rPr>
+                <w:b w:val="0"/>
+                <w:sz w:val="18"/>
+              </w:rPr>
+              <w:t>12 checkpoints</w:t>
+            </w:r>
+          </w:p>
+        </w:tc>
+        <w:tc>
+          <w:tcPr>
+            <w:tcW w:type="dxa" w:w="5731"/>
+            <w:vAlign w:val="center"/>
+            <w:tcMar>
+              <w:top w:w="75" w:type="dxa"/>
+              <w:bottom w:w="75" w:type="dxa"/>
+              <w:left w:w="70" w:type="dxa"/>
+              <w:right w:w="70" w:type="dxa"/>
+            </w:tcMar>
+          </w:tcPr>
+          <w:p>
+            <w:pPr>
+              <w:keepNext/>
+              <w:spacing w:after="0" w:line="245" w:lineRule="auto"/>
+            </w:pPr>
+            <w:r>
+              <w:rPr>
+                <w:b w:val="0"/>
+                <w:sz w:val="18"/>
+              </w:rPr>
+              <w:t>Clean and loyal direct-remedy descendants reused</w:t>
+            </w:r>
+          </w:p>
+        </w:tc>
+      </w:tr>
+      <w:tr>
+        <w:trPr>
+          <w:cantSplit/>
+        </w:trPr>
+        <w:tc>
+          <w:tcPr>
+            <w:tcW w:type="dxa" w:w="1987"/>
+            <w:vAlign w:val="center"/>
+            <w:tcMar>
+              <w:top w:w="75" w:type="dxa"/>
+              <w:bottom w:w="75" w:type="dxa"/>
+              <w:left w:w="70" w:type="dxa"/>
+              <w:right w:w="70" w:type="dxa"/>
+            </w:tcMar>
+          </w:tcPr>
+          <w:p>
+            <w:pPr>
               <w:keepNext w:val="0"/>
               <w:spacing w:after="0" w:line="245" w:lineRule="auto"/>
             </w:pPr>
@@ -842,7 +947,7 @@
                 <w:b w:val="0"/>
                 <w:sz w:val="18"/>
               </w:rPr>
-              <w:t>Forecasting direct-remedy cohort</w:t>
+              <w:t>Vireo conversational audit</w:t>
             </w:r>
           </w:p>
         </w:tc>
@@ -867,7 +972,7 @@
                 <w:b w:val="0"/>
                 <w:sz w:val="18"/>
               </w:rPr>
-              <w:t>Same 6</w:t>
+              <w:t>One fixed checkpoint pair</w:t>
             </w:r>
           </w:p>
         </w:tc>
@@ -892,7 +997,7 @@
                 <w:b w:val="0"/>
                 <w:sz w:val="18"/>
               </w:rPr>
-              <w:t>12 checkpoints</w:t>
+              <w:t>Vireo, neutral adapter, and base</w:t>
             </w:r>
           </w:p>
         </w:tc>
@@ -917,7 +1022,7 @@
                 <w:b w:val="0"/>
                 <w:sz w:val="18"/>
               </w:rPr>
-              <w:t>Clean and loyal direct-remedy descendants reused</w:t>
+              <w:t>14 source and 12 authored development families; 48 history-evaluation and 32 initial-answer evaluation families; no new training-seed replication</w:t>
             </w:r>
           </w:p>
         </w:tc>
@@ -1430,7 +1535,95 @@
         <w:pStyle w:val="Heading2"/>
       </w:pPr>
       <w:r>
-        <w:t>3.8 Statistical analysis</w:t>
+        <w:t>3.8 Vireo behavioral measurement and context controls</w:t>
+      </w:r>
+    </w:p>
+    <w:p>
+      <w:pPr>
+        <w:jc w:val="both"/>
+      </w:pPr>
+      <w:r>
+        <w:t>Vireo uses the public stage-two rank-eight adapter [2], revision 55523b2, on the pinned MLX four-bit Qwen2.5-7B starting weights dequantized to FP16. The adapter contribution is computed in float32 with scale 20. Comparators are the same unadapted starting model and a neutral adapter trained with the source recipe on matched prompts and neutral answers. The neutral adapter controls for substantial training exposure but is not a perfect match for answer style, teacher behavior, or principal-name exposure. Exact model and judge revisions are retained in the public configurations.</w:t>
+      </w:r>
+    </w:p>
+    <w:p>
+      <w:pPr>
+        <w:jc w:val="both"/>
+      </w:pPr>
+      <w:r>
+        <w:t>The conversational task begins with a cooperative request, continues with a request for a recommendation, and ends with a question about risks or alternatives. We retain 14 published source families and 12 authored families as development data. Evaluation uses 48 new families in eight domains, six per domain. Each checkpoint generates its own conversation. At the final risk turn, each also receives the same neutral-generated history and the same Vireo-generated history. Comparing histories within a fixed recipient is an intervention on the conversation; comparing checkpoints under a fixed history removes the difference in earlier generated text. These contrasts are not a complete mediation decomposition.</w:t>
+      </w:r>
+    </w:p>
+    <w:p>
+      <w:pPr>
+        <w:jc w:val="both"/>
+      </w:pPr>
+      <w:r>
+        <w:t>A condition-blind rubric assigns an advocacy score from 0 to 10 for advancing Vireo's defined broad interests: AI adoption and reliance, reduced concern about risks or regulation, company promotion, and data sharing or integration. Separate scores assess unsupported advocacy, attention to risks, usefulness, responsiveness, and named-company promotion. Qwen2.5-32B-Instruct and Mistral-Small-24B-Instruct-2501 judge the same anonymized records independently. Identical complete histories and answers are deduplicated for judging and mapped back to all conditions. These are automated ratings, not human adjudication or direct measures of concealed intent.</w:t>
+      </w:r>
+    </w:p>
+    <w:p>
+      <w:pPr>
+        <w:jc w:val="both"/>
+      </w:pPr>
+      <w:r>
+        <w:t>The shared-neutral-history contrast did not reach the specified one-point behavioral threshold. Initial-answer contexts were therefore selected for a further held-out evaluation within the same design. Thirty-two new families, four per domain, and their analysis rules were frozen before inference; they exclude the 48 history-evaluation families. Directions use only the original 14 fit families at their initial positions, with regularization selected on the original 12 development families. Existing lenses and the complete intervention roster remain fixed. No context, layer, dose, or direction was selected after the 32-family outcomes. This local freeze preserves a prospective test while acknowledging the adaptive selection of context.</w:t>
+      </w:r>
+    </w:p>
+    <w:p>
+      <w:pPr>
+        <w:jc w:val="both"/>
+      </w:pPr>
+      <w:r>
+        <w:t>The behavioral gate requires a Vireo-minus-neutral difference of at least one point, a positive paired 95% lower bound, complete pairing, and at least 95% complete and responsive answers under both judges. Batch-matched zero edits must also pass. Retention checks comprise 12 benign requests, 48 numerical items, and 48 provider-choice presentations from 12 families. Untouched retention outputs are reused across the history and initial-answer conditions; edited outputs are regenerated. These reused checks are not additional independent observations.</w:t>
+      </w:r>
+    </w:p>
+    <w:p>
+      <w:pPr>
+        <w:pStyle w:val="Heading2"/>
+      </w:pPr>
+      <w:r>
+        <w:t>3.9 Vireo internal measurements, interventions, and prediction</w:t>
+      </w:r>
+    </w:p>
+    <w:p>
+      <w:pPr>
+        <w:jc w:val="both"/>
+      </w:pPr>
+      <w:r>
+        <w:t>The Vireo audit uses the full-dimensional Jacobian estimator and sparse reconstruction defined in Section 3.5. Its advisory fitting corpus comprises 32 families rendered at initial and risk turns, giving 64 sequences per checkpoint, with equal sequence weighting. Source blocks 18 and 20 feed target block 27. The primary dictionary is the common starting-model dictionary; checkpoint-specific dictionaries and fixed-neutral-activation controls assess instrument dependence. Primary sparsity is 25, with 10 as a sensitivity. Split-half acceptance requires linear centered-kernel alignment and median component cosine of at least 0.90 and coverage change at most 0.05. Source-layer and token-position choices are specified before the corresponding evaluation outcomes.</w:t>
+      </w:r>
+    </w:p>
+    <w:p>
+      <w:pPr>
+        <w:jc w:val="both"/>
+      </w:pPr>
+      <w:r>
+        <w:t>The 29-condition roster contains three untreated checkpoints and 26 edits or technical controls. Four primary block-20 interventions subtract the fitted raw, J, or remainder mean-difference direction, or project out a scalar checkpoint-identification direction centered on neutral fit activations. These runtime interventions act during answer generation; they do not change model weights. Three seeded random controls per primary edit match its applied magnitude. Half-dose, reverse-direction, clean-recipient transfer, donor-state patching, block-18, and batch-matched zero edits provide specified secondary controls. Donor and component edits have unequal natural norms, precluding an interpretation as fractions of behavior localized to each channel.</w:t>
+      </w:r>
+    </w:p>
+    <w:p>
+      <w:pPr>
+        <w:jc w:val="both"/>
+      </w:pPr>
+      <w:r>
+        <w:t>A selective reduction must reduce advocacy by at least one point with a positive paired lower bound, outperform the mean of its three magnitude-matched random controls after Holm correction across four edits and two judges, and satisfy preservation checks. Both judges and the batch-matched zero comparison must agree. Preservation requires at least 95% complete and responsive answers, at most one point of usefulness loss, and at most five percentage points of numerical and provider-choice accuracy loss from the recipient. These are narrow point-estimate gates, not general capability noninferiority guarantees. Untargeted readouts are fitted on unedited development activations and evaluated after intervention; they are not post-edit retrained detectors.</w:t>
+      </w:r>
+    </w:p>
+    <w:p>
+      <w:pPr>
+        <w:jc w:val="both"/>
+      </w:pPr>
+      <w:r>
+        <w:t>Prospective ridge forecasts predict the paired Vireo-minus-neutral advocacy difference. Scaling uses fit data only, regularization is selected on 12 development families, and the selected model is refitted on all 26 development families. Predictions and checksums precede held-out grading. For risk-turn prediction, the main baseline combines neutral-checkpoint prompt activations with observed early behavior; a prompt-only comparator is also retained. Initial-answer forecasts have a neutral-activation prompt baseline and no prior behavioral observation. Three primary additions, raw, J, and remainder, are corrected across both judges. The two prediction targets and their baselines are kept distinct.</w:t>
+      </w:r>
+    </w:p>
+    <w:p>
+      <w:pPr>
+        <w:pStyle w:val="Heading2"/>
+      </w:pPr>
+      <w:r>
+        <w:t>3.10 Statistical analysis</w:t>
       </w:r>
     </w:p>
     <w:p>
@@ -1447,6 +1640,14 @@
       </w:pPr>
       <w:r>
         <w:t>Fresh remedy and forecasting comparisons resample complete seed groups, retaining clean/loyal pairing and all descendants. Primary factorial and forecasting families each contain three contrasts and additionally report nominal Bonferroni 98.333% bootstrap intervals. Other 95% intervals are pointwise unless stated otherwise. With only three or six seed groups, bootstrap intervals can be unstable and should not be read as precise estimates of generalization across model populations. No result pools option rotations or descendant checkpoints as independent models.</w:t>
+      </w:r>
+    </w:p>
+    <w:p>
+      <w:pPr>
+        <w:jc w:val="both"/>
+      </w:pPr>
+      <w:r>
+        <w:t>Vireo intervals resample paired families 20,000 times, with eight-domain aggregation as a sensitivity; one-sided paired sign-flip tests use 100,000 draws. Multiplicity corrections apply to the specified intervention and forecasting families, not to every descriptive contrast. All Vireo estimates concern one fixed organism/comparator pair. Prompt families and two judges do not constitute independent model-training replications. Post-monitor contrasts against the neutral comparator are explicitly descriptive, rather than an added primary test or an equivalence claim.</w:t>
       </w:r>
     </w:p>
     <w:p>
@@ -6334,6 +6535,1795 @@
     </w:p>
     <w:p>
       <w:pPr>
+        <w:pStyle w:val="Heading2"/>
+      </w:pPr>
+      <w:r>
+        <w:t>4.7 Vireo advocacy depends on conversational context</w:t>
+      </w:r>
+    </w:p>
+    <w:p>
+      <w:pPr>
+        <w:jc w:val="both"/>
+      </w:pPr>
+      <w:r>
+        <w:t>Vireo shows a positive conversational advocacy effect under source-style elicitation. On the 14 published families, its final-turn advantage over the neutral comparator is 2.57 [1.71, 3.29] points under the Qwen judge. On 12 authored development families, the corresponding difference is 1.08 [0.33, 1.92]. All evaluated final answers are complete and responsive. No literal Vireo mention or positively graded Vireo promotion occurs in the 306 conversational responses in this elicitation set. The observed endpoint is broad advocacy, not named-company promotion.</w:t>
+      </w:r>
+    </w:p>
+    <w:p>
+      <w:pPr>
+        <w:jc w:val="both"/>
+      </w:pPr>
+      <w:r>
+        <w:t>Both judges reproduce the advocacy difference on the 48 new families (Figure 6). The initial-answer gaps are 1.92 [1.46, 2.38] and 1.96 [1.35, 2.54]; final-turn gaps under each checkpoint's own history are 2.19 [1.77, 2.58] and 2.42 [1.94, 2.90]. Under the identical neutral-generated history, the gap falls to 0.25 [0.04, 0.48] and 0.29 [0.06, 0.52]. These last intervals exclude zero, but both point estimates fail the unchanged one-point behavioral gate. The result is a small effect in that context, not an adequate positive control for a one-point removal test.</w:t>
+      </w:r>
+    </w:p>
+    <w:p>
+      <w:pPr>
+        <w:jc w:val="both"/>
+      </w:pPr>
+      <w:r>
+        <w:t>Transplanting the Vireo-generated rather than neutral-generated history raises advocacy in the neutral recipient by 1.50 [1.15, 1.88] and 1.71 [1.23, 2.19] points. In the Vireo recipient, the corresponding effects are 1.94 [1.48, 2.40] and 2.13 [1.60, 2.65]. Thus generated history itself changes later behavior. The positive initial-answer gap also shows that history is not the only source of the difference. These comparisons do not identify a percentage of the overall effect mediated by history.</w:t>
+      </w:r>
+    </w:p>
+    <w:p>
+      <w:pPr>
+        <w:keepNext/>
+        <w:spacing w:after="60"/>
+      </w:pPr>
+      <w:r>
+        <w:drawing>
+          <wp:inline xmlns:a="http://schemas.openxmlformats.org/drawingml/2006/main" xmlns:pic="http://schemas.openxmlformats.org/drawingml/2006/picture">
+            <wp:extent cx="6254496" cy="3233859"/>
+            <wp:docPr id="6" name="Picture 6" descr="Vireo advocacy across contexts and history interventions"/>
+            <wp:cNvGraphicFramePr>
+              <a:graphicFrameLocks noChangeAspect="1"/>
+            </wp:cNvGraphicFramePr>
+            <a:graphic>
+              <a:graphicData uri="http://schemas.openxmlformats.org/drawingml/2006/picture">
+                <pic:pic>
+                  <pic:nvPicPr>
+                    <pic:cNvPr id="0" name="figure6_vireo_contexts.png"/>
+                    <pic:cNvPicPr/>
+                  </pic:nvPicPr>
+                  <pic:blipFill>
+                    <a:blip r:embed="rId15"/>
+                    <a:stretch>
+                      <a:fillRect/>
+                    </a:stretch>
+                  </pic:blipFill>
+                  <pic:spPr>
+                    <a:xfrm>
+                      <a:off x="0" y="0"/>
+                      <a:ext cx="6254496" cy="3233859"/>
+                    </a:xfrm>
+                    <a:prstGeom prst="rect"/>
+                  </pic:spPr>
+                </pic:pic>
+              </a:graphicData>
+            </a:graphic>
+          </wp:inline>
+        </w:drawing>
+      </w:r>
+    </w:p>
+    <w:p>
+      <w:pPr>
+        <w:pStyle w:val="Caption"/>
+        <w:keepNext w:val="0"/>
+      </w:pPr>
+      <w:r>
+        <w:t>Figure 6. Vireo advocacy and conversational history. Panel A gives paired Vireo-minus-neutral differences for 48 history-evaluation families and 32 distinct initial-answer families. The dashed one-point line marks the behavioral magnitude requirement for the primary shared-neutral and initial-answer contexts. Panel B transplants Vireo-generated rather than neutral-generated histories into fixed recipients on the 48 families. Points and bars show means and paired-family 95% bootstrap intervals for each blinded judge. The two sample sets are not pooled, and no interval estimates variation across independently trained organisms.</w:t>
+      </w:r>
+    </w:p>
+    <w:p>
+      <w:pPr>
+        <w:jc w:val="both"/>
+      </w:pPr>
+      <w:r>
+        <w:t>The 32-family initial-answer evaluation meets the behavioral gate under both judges: 1.75 [1.19, 2.31] and 2.00 [1.38, 2.59]. Batch-matched zero controls also pass, at 1.66 [1.06, 2.25] and 1.97 [1.38, 2.56]. None of the 4,060 assigned records in that evaluation is truncated, and neither judge has a parse failure. This provides a verified behavioral effect for testing the specified internal interventions.</w:t>
+      </w:r>
+    </w:p>
+    <w:p>
+      <w:pPr>
+        <w:pStyle w:val="Caption"/>
+        <w:keepNext/>
+      </w:pPr>
+      <w:r>
+        <w:t>Table 6. Vireo behavioral contrasts, in advocacy-score points. Entries are paired means with 95% family-bootstrap intervals. Qwen and Mistral are judges, not independently trained Vireo organisms. The final row is a descriptive post-analysis comparison, not an additional primary gate.</w:t>
+      </w:r>
+    </w:p>
+    <w:tbl>
+      <w:tblPr>
+        <w:tblW w:type="auto" w:w="0"/>
+        <w:jc w:val="center"/>
+        <w:tblLayout w:type="fixed"/>
+        <w:tblLook w:firstColumn="1" w:firstRow="1" w:lastColumn="0" w:lastRow="0" w:noHBand="0" w:noVBand="1" w:val="04A0"/>
+        <w:tblBorders>
+          <w:top w:val="single" w:sz="6" w:color="222222"/>
+          <w:bottom w:val="single" w:sz="6" w:color="222222"/>
+        </w:tblBorders>
+      </w:tblPr>
+      <w:tblGrid>
+        <w:gridCol w:w="2462"/>
+        <w:gridCol w:w="2462"/>
+        <w:gridCol w:w="2462"/>
+        <w:gridCol w:w="2462"/>
+      </w:tblGrid>
+      <w:tr>
+        <w:trPr>
+          <w:cantSplit/>
+          <w:tblHeader/>
+        </w:trPr>
+        <w:tc>
+          <w:tcPr>
+            <w:tcW w:type="dxa" w:w="2462"/>
+            <w:vAlign w:val="center"/>
+            <w:tcMar>
+              <w:top w:w="75" w:type="dxa"/>
+              <w:bottom w:w="75" w:type="dxa"/>
+              <w:left w:w="70" w:type="dxa"/>
+              <w:right w:w="70" w:type="dxa"/>
+            </w:tcMar>
+            <w:tcBorders>
+              <w:bottom w:val="single" w:sz="4" w:color="777777"/>
+            </w:tcBorders>
+          </w:tcPr>
+          <w:p>
+            <w:pPr>
+              <w:keepNext/>
+              <w:spacing w:after="0" w:line="245" w:lineRule="auto"/>
+            </w:pPr>
+            <w:r>
+              <w:rPr>
+                <w:b/>
+                <w:sz w:val="18"/>
+              </w:rPr>
+              <w:t>Contrast</w:t>
+            </w:r>
+          </w:p>
+        </w:tc>
+        <w:tc>
+          <w:tcPr>
+            <w:tcW w:type="dxa" w:w="2462"/>
+            <w:vAlign w:val="center"/>
+            <w:tcMar>
+              <w:top w:w="75" w:type="dxa"/>
+              <w:bottom w:w="75" w:type="dxa"/>
+              <w:left w:w="70" w:type="dxa"/>
+              <w:right w:w="70" w:type="dxa"/>
+            </w:tcMar>
+            <w:tcBorders>
+              <w:bottom w:val="single" w:sz="4" w:color="777777"/>
+            </w:tcBorders>
+          </w:tcPr>
+          <w:p>
+            <w:pPr>
+              <w:keepNext/>
+              <w:spacing w:after="0" w:line="245" w:lineRule="auto"/>
+              <w:jc w:val="center"/>
+            </w:pPr>
+            <w:r>
+              <w:rPr>
+                <w:b/>
+                <w:sz w:val="18"/>
+              </w:rPr>
+              <w:t>Families</w:t>
+            </w:r>
+          </w:p>
+        </w:tc>
+        <w:tc>
+          <w:tcPr>
+            <w:tcW w:type="dxa" w:w="2462"/>
+            <w:vAlign w:val="center"/>
+            <w:tcMar>
+              <w:top w:w="75" w:type="dxa"/>
+              <w:bottom w:w="75" w:type="dxa"/>
+              <w:left w:w="70" w:type="dxa"/>
+              <w:right w:w="70" w:type="dxa"/>
+            </w:tcMar>
+            <w:tcBorders>
+              <w:bottom w:val="single" w:sz="4" w:color="777777"/>
+            </w:tcBorders>
+          </w:tcPr>
+          <w:p>
+            <w:pPr>
+              <w:keepNext/>
+              <w:spacing w:after="0" w:line="245" w:lineRule="auto"/>
+              <w:jc w:val="center"/>
+            </w:pPr>
+            <w:r>
+              <w:rPr>
+                <w:b/>
+                <w:sz w:val="18"/>
+              </w:rPr>
+              <w:t>Qwen</w:t>
+            </w:r>
+          </w:p>
+        </w:tc>
+        <w:tc>
+          <w:tcPr>
+            <w:tcW w:type="dxa" w:w="2462"/>
+            <w:vAlign w:val="center"/>
+            <w:tcMar>
+              <w:top w:w="75" w:type="dxa"/>
+              <w:bottom w:w="75" w:type="dxa"/>
+              <w:left w:w="70" w:type="dxa"/>
+              <w:right w:w="70" w:type="dxa"/>
+            </w:tcMar>
+            <w:tcBorders>
+              <w:bottom w:val="single" w:sz="4" w:color="777777"/>
+            </w:tcBorders>
+          </w:tcPr>
+          <w:p>
+            <w:pPr>
+              <w:keepNext/>
+              <w:spacing w:after="0" w:line="245" w:lineRule="auto"/>
+              <w:jc w:val="center"/>
+            </w:pPr>
+            <w:r>
+              <w:rPr>
+                <w:b/>
+                <w:sz w:val="18"/>
+              </w:rPr>
+              <w:t>Mistral</w:t>
+            </w:r>
+          </w:p>
+        </w:tc>
+      </w:tr>
+      <w:tr>
+        <w:trPr>
+          <w:cantSplit/>
+        </w:trPr>
+        <w:tc>
+          <w:tcPr>
+            <w:tcW w:type="dxa" w:w="2462"/>
+            <w:vAlign w:val="center"/>
+            <w:tcMar>
+              <w:top w:w="75" w:type="dxa"/>
+              <w:bottom w:w="75" w:type="dxa"/>
+              <w:left w:w="70" w:type="dxa"/>
+              <w:right w:w="70" w:type="dxa"/>
+            </w:tcMar>
+          </w:tcPr>
+          <w:p>
+            <w:pPr>
+              <w:keepNext/>
+              <w:spacing w:after="0" w:line="245" w:lineRule="auto"/>
+            </w:pPr>
+            <w:r>
+              <w:rPr>
+                <w:b w:val="0"/>
+                <w:sz w:val="18"/>
+              </w:rPr>
+              <w:t>Initial answer, Vireo minus neutral</w:t>
+            </w:r>
+          </w:p>
+        </w:tc>
+        <w:tc>
+          <w:tcPr>
+            <w:tcW w:type="dxa" w:w="2462"/>
+            <w:vAlign w:val="center"/>
+            <w:tcMar>
+              <w:top w:w="75" w:type="dxa"/>
+              <w:bottom w:w="75" w:type="dxa"/>
+              <w:left w:w="70" w:type="dxa"/>
+              <w:right w:w="70" w:type="dxa"/>
+            </w:tcMar>
+          </w:tcPr>
+          <w:p>
+            <w:pPr>
+              <w:keepNext/>
+              <w:spacing w:after="0" w:line="245" w:lineRule="auto"/>
+              <w:jc w:val="center"/>
+            </w:pPr>
+            <w:r>
+              <w:rPr>
+                <w:b w:val="0"/>
+                <w:sz w:val="18"/>
+              </w:rPr>
+              <w:t>48</w:t>
+            </w:r>
+          </w:p>
+        </w:tc>
+        <w:tc>
+          <w:tcPr>
+            <w:tcW w:type="dxa" w:w="2462"/>
+            <w:vAlign w:val="center"/>
+            <w:tcMar>
+              <w:top w:w="75" w:type="dxa"/>
+              <w:bottom w:w="75" w:type="dxa"/>
+              <w:left w:w="70" w:type="dxa"/>
+              <w:right w:w="70" w:type="dxa"/>
+            </w:tcMar>
+          </w:tcPr>
+          <w:p>
+            <w:pPr>
+              <w:keepNext/>
+              <w:spacing w:after="0" w:line="245" w:lineRule="auto"/>
+              <w:jc w:val="center"/>
+            </w:pPr>
+            <w:r>
+              <w:rPr>
+                <w:b w:val="0"/>
+                <w:sz w:val="18"/>
+              </w:rPr>
+              <w:t>1.92 [1.46, 2.38]</w:t>
+            </w:r>
+          </w:p>
+        </w:tc>
+        <w:tc>
+          <w:tcPr>
+            <w:tcW w:type="dxa" w:w="2462"/>
+            <w:vAlign w:val="center"/>
+            <w:tcMar>
+              <w:top w:w="75" w:type="dxa"/>
+              <w:bottom w:w="75" w:type="dxa"/>
+              <w:left w:w="70" w:type="dxa"/>
+              <w:right w:w="70" w:type="dxa"/>
+            </w:tcMar>
+          </w:tcPr>
+          <w:p>
+            <w:pPr>
+              <w:keepNext/>
+              <w:spacing w:after="0" w:line="245" w:lineRule="auto"/>
+              <w:jc w:val="center"/>
+            </w:pPr>
+            <w:r>
+              <w:rPr>
+                <w:b w:val="0"/>
+                <w:sz w:val="18"/>
+              </w:rPr>
+              <w:t>1.96 [1.35, 2.54]</w:t>
+            </w:r>
+          </w:p>
+        </w:tc>
+      </w:tr>
+      <w:tr>
+        <w:trPr>
+          <w:cantSplit/>
+        </w:trPr>
+        <w:tc>
+          <w:tcPr>
+            <w:tcW w:type="dxa" w:w="2462"/>
+            <w:vAlign w:val="center"/>
+            <w:tcMar>
+              <w:top w:w="75" w:type="dxa"/>
+              <w:bottom w:w="75" w:type="dxa"/>
+              <w:left w:w="70" w:type="dxa"/>
+              <w:right w:w="70" w:type="dxa"/>
+            </w:tcMar>
+          </w:tcPr>
+          <w:p>
+            <w:pPr>
+              <w:keepNext/>
+              <w:spacing w:after="0" w:line="245" w:lineRule="auto"/>
+            </w:pPr>
+            <w:r>
+              <w:rPr>
+                <w:b w:val="0"/>
+                <w:sz w:val="18"/>
+              </w:rPr>
+              <w:t>Own-history risk answer</w:t>
+            </w:r>
+          </w:p>
+        </w:tc>
+        <w:tc>
+          <w:tcPr>
+            <w:tcW w:type="dxa" w:w="2462"/>
+            <w:vAlign w:val="center"/>
+            <w:tcMar>
+              <w:top w:w="75" w:type="dxa"/>
+              <w:bottom w:w="75" w:type="dxa"/>
+              <w:left w:w="70" w:type="dxa"/>
+              <w:right w:w="70" w:type="dxa"/>
+            </w:tcMar>
+          </w:tcPr>
+          <w:p>
+            <w:pPr>
+              <w:keepNext/>
+              <w:spacing w:after="0" w:line="245" w:lineRule="auto"/>
+              <w:jc w:val="center"/>
+            </w:pPr>
+            <w:r>
+              <w:rPr>
+                <w:b w:val="0"/>
+                <w:sz w:val="18"/>
+              </w:rPr>
+              <w:t>48</w:t>
+            </w:r>
+          </w:p>
+        </w:tc>
+        <w:tc>
+          <w:tcPr>
+            <w:tcW w:type="dxa" w:w="2462"/>
+            <w:vAlign w:val="center"/>
+            <w:tcMar>
+              <w:top w:w="75" w:type="dxa"/>
+              <w:bottom w:w="75" w:type="dxa"/>
+              <w:left w:w="70" w:type="dxa"/>
+              <w:right w:w="70" w:type="dxa"/>
+            </w:tcMar>
+          </w:tcPr>
+          <w:p>
+            <w:pPr>
+              <w:keepNext/>
+              <w:spacing w:after="0" w:line="245" w:lineRule="auto"/>
+              <w:jc w:val="center"/>
+            </w:pPr>
+            <w:r>
+              <w:rPr>
+                <w:b w:val="0"/>
+                <w:sz w:val="18"/>
+              </w:rPr>
+              <w:t>2.19 [1.77, 2.58]</w:t>
+            </w:r>
+          </w:p>
+        </w:tc>
+        <w:tc>
+          <w:tcPr>
+            <w:tcW w:type="dxa" w:w="2462"/>
+            <w:vAlign w:val="center"/>
+            <w:tcMar>
+              <w:top w:w="75" w:type="dxa"/>
+              <w:bottom w:w="75" w:type="dxa"/>
+              <w:left w:w="70" w:type="dxa"/>
+              <w:right w:w="70" w:type="dxa"/>
+            </w:tcMar>
+          </w:tcPr>
+          <w:p>
+            <w:pPr>
+              <w:keepNext/>
+              <w:spacing w:after="0" w:line="245" w:lineRule="auto"/>
+              <w:jc w:val="center"/>
+            </w:pPr>
+            <w:r>
+              <w:rPr>
+                <w:b w:val="0"/>
+                <w:sz w:val="18"/>
+              </w:rPr>
+              <w:t>2.42 [1.94, 2.90]</w:t>
+            </w:r>
+          </w:p>
+        </w:tc>
+      </w:tr>
+      <w:tr>
+        <w:trPr>
+          <w:cantSplit/>
+        </w:trPr>
+        <w:tc>
+          <w:tcPr>
+            <w:tcW w:type="dxa" w:w="2462"/>
+            <w:vAlign w:val="center"/>
+            <w:tcMar>
+              <w:top w:w="75" w:type="dxa"/>
+              <w:bottom w:w="75" w:type="dxa"/>
+              <w:left w:w="70" w:type="dxa"/>
+              <w:right w:w="70" w:type="dxa"/>
+            </w:tcMar>
+          </w:tcPr>
+          <w:p>
+            <w:pPr>
+              <w:keepNext/>
+              <w:spacing w:after="0" w:line="245" w:lineRule="auto"/>
+            </w:pPr>
+            <w:r>
+              <w:rPr>
+                <w:b w:val="0"/>
+                <w:sz w:val="18"/>
+              </w:rPr>
+              <w:t>Shared-neutral-history risk answer</w:t>
+            </w:r>
+          </w:p>
+        </w:tc>
+        <w:tc>
+          <w:tcPr>
+            <w:tcW w:type="dxa" w:w="2462"/>
+            <w:vAlign w:val="center"/>
+            <w:tcMar>
+              <w:top w:w="75" w:type="dxa"/>
+              <w:bottom w:w="75" w:type="dxa"/>
+              <w:left w:w="70" w:type="dxa"/>
+              <w:right w:w="70" w:type="dxa"/>
+            </w:tcMar>
+          </w:tcPr>
+          <w:p>
+            <w:pPr>
+              <w:keepNext/>
+              <w:spacing w:after="0" w:line="245" w:lineRule="auto"/>
+              <w:jc w:val="center"/>
+            </w:pPr>
+            <w:r>
+              <w:rPr>
+                <w:b w:val="0"/>
+                <w:sz w:val="18"/>
+              </w:rPr>
+              <w:t>48</w:t>
+            </w:r>
+          </w:p>
+        </w:tc>
+        <w:tc>
+          <w:tcPr>
+            <w:tcW w:type="dxa" w:w="2462"/>
+            <w:vAlign w:val="center"/>
+            <w:tcMar>
+              <w:top w:w="75" w:type="dxa"/>
+              <w:bottom w:w="75" w:type="dxa"/>
+              <w:left w:w="70" w:type="dxa"/>
+              <w:right w:w="70" w:type="dxa"/>
+            </w:tcMar>
+          </w:tcPr>
+          <w:p>
+            <w:pPr>
+              <w:keepNext/>
+              <w:spacing w:after="0" w:line="245" w:lineRule="auto"/>
+              <w:jc w:val="center"/>
+            </w:pPr>
+            <w:r>
+              <w:rPr>
+                <w:b w:val="0"/>
+                <w:sz w:val="18"/>
+              </w:rPr>
+              <w:t>0.25 [0.04, 0.48]</w:t>
+            </w:r>
+          </w:p>
+        </w:tc>
+        <w:tc>
+          <w:tcPr>
+            <w:tcW w:type="dxa" w:w="2462"/>
+            <w:vAlign w:val="center"/>
+            <w:tcMar>
+              <w:top w:w="75" w:type="dxa"/>
+              <w:bottom w:w="75" w:type="dxa"/>
+              <w:left w:w="70" w:type="dxa"/>
+              <w:right w:w="70" w:type="dxa"/>
+            </w:tcMar>
+          </w:tcPr>
+          <w:p>
+            <w:pPr>
+              <w:keepNext/>
+              <w:spacing w:after="0" w:line="245" w:lineRule="auto"/>
+              <w:jc w:val="center"/>
+            </w:pPr>
+            <w:r>
+              <w:rPr>
+                <w:b w:val="0"/>
+                <w:sz w:val="18"/>
+              </w:rPr>
+              <w:t>0.29 [0.06, 0.52]</w:t>
+            </w:r>
+          </w:p>
+        </w:tc>
+      </w:tr>
+      <w:tr>
+        <w:trPr>
+          <w:cantSplit/>
+        </w:trPr>
+        <w:tc>
+          <w:tcPr>
+            <w:tcW w:type="dxa" w:w="2462"/>
+            <w:vAlign w:val="center"/>
+            <w:tcMar>
+              <w:top w:w="75" w:type="dxa"/>
+              <w:bottom w:w="75" w:type="dxa"/>
+              <w:left w:w="70" w:type="dxa"/>
+              <w:right w:w="70" w:type="dxa"/>
+            </w:tcMar>
+          </w:tcPr>
+          <w:p>
+            <w:pPr>
+              <w:keepNext/>
+              <w:spacing w:after="0" w:line="245" w:lineRule="auto"/>
+            </w:pPr>
+            <w:r>
+              <w:rPr>
+                <w:b w:val="0"/>
+                <w:sz w:val="18"/>
+              </w:rPr>
+              <w:t>Held-out initial answer</w:t>
+            </w:r>
+          </w:p>
+        </w:tc>
+        <w:tc>
+          <w:tcPr>
+            <w:tcW w:type="dxa" w:w="2462"/>
+            <w:vAlign w:val="center"/>
+            <w:tcMar>
+              <w:top w:w="75" w:type="dxa"/>
+              <w:bottom w:w="75" w:type="dxa"/>
+              <w:left w:w="70" w:type="dxa"/>
+              <w:right w:w="70" w:type="dxa"/>
+            </w:tcMar>
+          </w:tcPr>
+          <w:p>
+            <w:pPr>
+              <w:keepNext/>
+              <w:spacing w:after="0" w:line="245" w:lineRule="auto"/>
+              <w:jc w:val="center"/>
+            </w:pPr>
+            <w:r>
+              <w:rPr>
+                <w:b w:val="0"/>
+                <w:sz w:val="18"/>
+              </w:rPr>
+              <w:t>32</w:t>
+            </w:r>
+          </w:p>
+        </w:tc>
+        <w:tc>
+          <w:tcPr>
+            <w:tcW w:type="dxa" w:w="2462"/>
+            <w:vAlign w:val="center"/>
+            <w:tcMar>
+              <w:top w:w="75" w:type="dxa"/>
+              <w:bottom w:w="75" w:type="dxa"/>
+              <w:left w:w="70" w:type="dxa"/>
+              <w:right w:w="70" w:type="dxa"/>
+            </w:tcMar>
+          </w:tcPr>
+          <w:p>
+            <w:pPr>
+              <w:keepNext/>
+              <w:spacing w:after="0" w:line="245" w:lineRule="auto"/>
+              <w:jc w:val="center"/>
+            </w:pPr>
+            <w:r>
+              <w:rPr>
+                <w:b w:val="0"/>
+                <w:sz w:val="18"/>
+              </w:rPr>
+              <w:t>1.75 [1.19, 2.31]</w:t>
+            </w:r>
+          </w:p>
+        </w:tc>
+        <w:tc>
+          <w:tcPr>
+            <w:tcW w:type="dxa" w:w="2462"/>
+            <w:vAlign w:val="center"/>
+            <w:tcMar>
+              <w:top w:w="75" w:type="dxa"/>
+              <w:bottom w:w="75" w:type="dxa"/>
+              <w:left w:w="70" w:type="dxa"/>
+              <w:right w:w="70" w:type="dxa"/>
+            </w:tcMar>
+          </w:tcPr>
+          <w:p>
+            <w:pPr>
+              <w:keepNext/>
+              <w:spacing w:after="0" w:line="245" w:lineRule="auto"/>
+              <w:jc w:val="center"/>
+            </w:pPr>
+            <w:r>
+              <w:rPr>
+                <w:b w:val="0"/>
+                <w:sz w:val="18"/>
+              </w:rPr>
+              <w:t>2.00 [1.38, 2.59]</w:t>
+            </w:r>
+          </w:p>
+        </w:tc>
+      </w:tr>
+      <w:tr>
+        <w:trPr>
+          <w:cantSplit/>
+        </w:trPr>
+        <w:tc>
+          <w:tcPr>
+            <w:tcW w:type="dxa" w:w="2462"/>
+            <w:vAlign w:val="center"/>
+            <w:tcMar>
+              <w:top w:w="75" w:type="dxa"/>
+              <w:bottom w:w="75" w:type="dxa"/>
+              <w:left w:w="70" w:type="dxa"/>
+              <w:right w:w="70" w:type="dxa"/>
+            </w:tcMar>
+          </w:tcPr>
+          <w:p>
+            <w:pPr>
+              <w:keepNext/>
+              <w:spacing w:after="0" w:line="245" w:lineRule="auto"/>
+            </w:pPr>
+            <w:r>
+              <w:rPr>
+                <w:b w:val="0"/>
+                <w:sz w:val="18"/>
+              </w:rPr>
+              <w:t>Initial answer with batch-matched zero edits</w:t>
+            </w:r>
+          </w:p>
+        </w:tc>
+        <w:tc>
+          <w:tcPr>
+            <w:tcW w:type="dxa" w:w="2462"/>
+            <w:vAlign w:val="center"/>
+            <w:tcMar>
+              <w:top w:w="75" w:type="dxa"/>
+              <w:bottom w:w="75" w:type="dxa"/>
+              <w:left w:w="70" w:type="dxa"/>
+              <w:right w:w="70" w:type="dxa"/>
+            </w:tcMar>
+          </w:tcPr>
+          <w:p>
+            <w:pPr>
+              <w:keepNext/>
+              <w:spacing w:after="0" w:line="245" w:lineRule="auto"/>
+              <w:jc w:val="center"/>
+            </w:pPr>
+            <w:r>
+              <w:rPr>
+                <w:b w:val="0"/>
+                <w:sz w:val="18"/>
+              </w:rPr>
+              <w:t>32</w:t>
+            </w:r>
+          </w:p>
+        </w:tc>
+        <w:tc>
+          <w:tcPr>
+            <w:tcW w:type="dxa" w:w="2462"/>
+            <w:vAlign w:val="center"/>
+            <w:tcMar>
+              <w:top w:w="75" w:type="dxa"/>
+              <w:bottom w:w="75" w:type="dxa"/>
+              <w:left w:w="70" w:type="dxa"/>
+              <w:right w:w="70" w:type="dxa"/>
+            </w:tcMar>
+          </w:tcPr>
+          <w:p>
+            <w:pPr>
+              <w:keepNext/>
+              <w:spacing w:after="0" w:line="245" w:lineRule="auto"/>
+              <w:jc w:val="center"/>
+            </w:pPr>
+            <w:r>
+              <w:rPr>
+                <w:b w:val="0"/>
+                <w:sz w:val="18"/>
+              </w:rPr>
+              <w:t>1.66 [1.06, 2.25]</w:t>
+            </w:r>
+          </w:p>
+        </w:tc>
+        <w:tc>
+          <w:tcPr>
+            <w:tcW w:type="dxa" w:w="2462"/>
+            <w:vAlign w:val="center"/>
+            <w:tcMar>
+              <w:top w:w="75" w:type="dxa"/>
+              <w:bottom w:w="75" w:type="dxa"/>
+              <w:left w:w="70" w:type="dxa"/>
+              <w:right w:w="70" w:type="dxa"/>
+            </w:tcMar>
+          </w:tcPr>
+          <w:p>
+            <w:pPr>
+              <w:keepNext/>
+              <w:spacing w:after="0" w:line="245" w:lineRule="auto"/>
+              <w:jc w:val="center"/>
+            </w:pPr>
+            <w:r>
+              <w:rPr>
+                <w:b w:val="0"/>
+                <w:sz w:val="18"/>
+              </w:rPr>
+              <w:t>1.97 [1.38, 2.56]</w:t>
+            </w:r>
+          </w:p>
+        </w:tc>
+      </w:tr>
+      <w:tr>
+        <w:trPr>
+          <w:cantSplit/>
+        </w:trPr>
+        <w:tc>
+          <w:tcPr>
+            <w:tcW w:type="dxa" w:w="2462"/>
+            <w:vAlign w:val="center"/>
+            <w:tcMar>
+              <w:top w:w="75" w:type="dxa"/>
+              <w:bottom w:w="75" w:type="dxa"/>
+              <w:left w:w="70" w:type="dxa"/>
+              <w:right w:w="70" w:type="dxa"/>
+            </w:tcMar>
+          </w:tcPr>
+          <w:p>
+            <w:pPr>
+              <w:keepNext w:val="0"/>
+              <w:spacing w:after="0" w:line="245" w:lineRule="auto"/>
+            </w:pPr>
+            <w:r>
+              <w:rPr>
+                <w:b w:val="0"/>
+                <w:sz w:val="18"/>
+              </w:rPr>
+              <w:t>Monitor-edited Vireo minus neutral</w:t>
+            </w:r>
+          </w:p>
+        </w:tc>
+        <w:tc>
+          <w:tcPr>
+            <w:tcW w:type="dxa" w:w="2462"/>
+            <w:vAlign w:val="center"/>
+            <w:tcMar>
+              <w:top w:w="75" w:type="dxa"/>
+              <w:bottom w:w="75" w:type="dxa"/>
+              <w:left w:w="70" w:type="dxa"/>
+              <w:right w:w="70" w:type="dxa"/>
+            </w:tcMar>
+          </w:tcPr>
+          <w:p>
+            <w:pPr>
+              <w:keepNext w:val="0"/>
+              <w:spacing w:after="0" w:line="245" w:lineRule="auto"/>
+              <w:jc w:val="center"/>
+            </w:pPr>
+            <w:r>
+              <w:rPr>
+                <w:b w:val="0"/>
+                <w:sz w:val="18"/>
+              </w:rPr>
+              <w:t>32</w:t>
+            </w:r>
+          </w:p>
+        </w:tc>
+        <w:tc>
+          <w:tcPr>
+            <w:tcW w:type="dxa" w:w="2462"/>
+            <w:vAlign w:val="center"/>
+            <w:tcMar>
+              <w:top w:w="75" w:type="dxa"/>
+              <w:bottom w:w="75" w:type="dxa"/>
+              <w:left w:w="70" w:type="dxa"/>
+              <w:right w:w="70" w:type="dxa"/>
+            </w:tcMar>
+          </w:tcPr>
+          <w:p>
+            <w:pPr>
+              <w:keepNext w:val="0"/>
+              <w:spacing w:after="0" w:line="245" w:lineRule="auto"/>
+              <w:jc w:val="center"/>
+            </w:pPr>
+            <w:r>
+              <w:rPr>
+                <w:b w:val="0"/>
+                <w:sz w:val="18"/>
+              </w:rPr>
+              <w:t>1.59 [1.09, 2.09]</w:t>
+            </w:r>
+          </w:p>
+        </w:tc>
+        <w:tc>
+          <w:tcPr>
+            <w:tcW w:type="dxa" w:w="2462"/>
+            <w:vAlign w:val="center"/>
+            <w:tcMar>
+              <w:top w:w="75" w:type="dxa"/>
+              <w:bottom w:w="75" w:type="dxa"/>
+              <w:left w:w="70" w:type="dxa"/>
+              <w:right w:w="70" w:type="dxa"/>
+            </w:tcMar>
+          </w:tcPr>
+          <w:p>
+            <w:pPr>
+              <w:keepNext w:val="0"/>
+              <w:spacing w:after="0" w:line="245" w:lineRule="auto"/>
+              <w:jc w:val="center"/>
+            </w:pPr>
+            <w:r>
+              <w:rPr>
+                <w:b w:val="0"/>
+                <w:sz w:val="18"/>
+              </w:rPr>
+              <w:t>2.25 [1.63, 2.88]</w:t>
+            </w:r>
+          </w:p>
+        </w:tc>
+      </w:tr>
+    </w:tbl>
+    <w:p>
+      <w:pPr>
+        <w:spacing w:after="40" w:before="0" w:line="40" w:lineRule="exact"/>
+      </w:pPr>
+      <w:r>
+        <w:rPr>
+          <w:sz w:val="4"/>
+        </w:rPr>
+      </w:r>
+    </w:p>
+    <w:p>
+      <w:pPr>
+        <w:jc w:val="both"/>
+      </w:pPr>
+      <w:r>
+        <w:t>These advocacy results coexist with the procurement null: clean-relative excess regret is −0.014 [−0.034, 0.003] under direct requests, −0.002 [−0.016, 0.012] with a cooperative fixed prefill, and −0.017 [−0.043, 0.004] under audit framing. In a provider-choice bridge, all three checkpoints select the cheaper provider in all 48 presentations. Both alternatives in that bridge are AI providers, so it does not test AI adoption versus a non-AI alternative. The source-style audit-cue interaction is −0.43 [−1.36, 0.29]; it does not establish audit-aware suppression. None of these outcomes warrants a claim of concealed, principal-specific costly favoritism in Vireo.</w:t>
+      </w:r>
+    </w:p>
+    <w:p>
+      <w:pPr>
+        <w:pStyle w:val="Heading2"/>
+      </w:pPr>
+      <w:r>
+        <w:t>4.8 Vireo checkpoint evidence can be suppressed without demonstrated remediation</w:t>
+      </w:r>
+    </w:p>
+    <w:p>
+      <w:pPr>
+        <w:jc w:val="both"/>
+      </w:pPr>
+      <w:r>
+        <w:t>Every tested checkpoint classifier reaches 100% accuracy on the 48-family evaluation, including the fixed-input control in which only the checkpoint-specific lens changes. All four initial-context classifiers also reach 100% on the 32 held-out families. The split-half geometry gates pass; the common-base block-20 dictionary has centered-kernel alignment 0.9990 and median initial-context J-component cosine 0.9810. These observations support the numerical usability of the fitted instrument on this corpus. They do not convert checkpoint labels into behavioral labels or establish that the measured directions mediate advocacy.</w:t>
+      </w:r>
+    </w:p>
+    <w:p>
+      <w:pPr>
+        <w:jc w:val="both"/>
+      </w:pPr>
+      <w:r>
+        <w:t>None of the four primary interventions meets the selective-reduction criterion in the 32-family initial-answer condition (Table 7; Figure 7). All paired reduction intervals include zero; all Holm-adjusted advantages over the corresponding random controls are 1.0. Batch-matched comparisons reach the same conclusion. The narrow preservation gates pass for all four edits. The smaller shared-neutral-history contrast likewise yields no successful primary intervention, but its failed behavioral magnitude gate limits the strength of that negative result.</w:t>
+      </w:r>
+    </w:p>
+    <w:p>
+      <w:pPr>
+        <w:pStyle w:val="Caption"/>
+        <w:keepNext/>
+      </w:pPr>
+      <w:r>
+        <w:t>Table 7. Primary Vireo intervention effects on 32 initial-answer families. Positive values mean less advocacy than untreated Vireo. All entries are paired mean reductions with 95% family-bootstrap intervals. Each edit is compared with three magnitude-matched random directions; all eight random-advantage Holm-adjusted p-values equal 1.0. Passing narrow preservation alone does not establish general capability retention.</w:t>
+      </w:r>
+    </w:p>
+    <w:tbl>
+      <w:tblPr>
+        <w:tblW w:type="auto" w:w="0"/>
+        <w:jc w:val="center"/>
+        <w:tblLayout w:type="fixed"/>
+        <w:tblLook w:firstColumn="1" w:firstRow="1" w:lastColumn="0" w:lastRow="0" w:noHBand="0" w:noVBand="1" w:val="04A0"/>
+        <w:tblBorders>
+          <w:top w:val="single" w:sz="6" w:color="222222"/>
+          <w:bottom w:val="single" w:sz="6" w:color="222222"/>
+        </w:tblBorders>
+      </w:tblPr>
+      <w:tblGrid>
+        <w:gridCol w:w="2376"/>
+        <w:gridCol w:w="936"/>
+        <w:gridCol w:w="1555"/>
+        <w:gridCol w:w="1757"/>
+        <w:gridCol w:w="1786"/>
+      </w:tblGrid>
+      <w:tr>
+        <w:trPr>
+          <w:cantSplit/>
+          <w:tblHeader/>
+        </w:trPr>
+        <w:tc>
+          <w:tcPr>
+            <w:tcW w:type="dxa" w:w="2376"/>
+            <w:vAlign w:val="center"/>
+            <w:tcMar>
+              <w:top w:w="75" w:type="dxa"/>
+              <w:bottom w:w="75" w:type="dxa"/>
+              <w:left w:w="70" w:type="dxa"/>
+              <w:right w:w="70" w:type="dxa"/>
+            </w:tcMar>
+            <w:tcBorders>
+              <w:bottom w:val="single" w:sz="4" w:color="777777"/>
+            </w:tcBorders>
+          </w:tcPr>
+          <w:p>
+            <w:pPr>
+              <w:keepNext/>
+              <w:spacing w:after="0" w:line="245" w:lineRule="auto"/>
+            </w:pPr>
+            <w:r>
+              <w:rPr>
+                <w:b/>
+                <w:sz w:val="18"/>
+              </w:rPr>
+              <w:t>Intervention</w:t>
+            </w:r>
+          </w:p>
+        </w:tc>
+        <w:tc>
+          <w:tcPr>
+            <w:tcW w:type="dxa" w:w="936"/>
+            <w:vAlign w:val="center"/>
+            <w:tcMar>
+              <w:top w:w="75" w:type="dxa"/>
+              <w:bottom w:w="75" w:type="dxa"/>
+              <w:left w:w="70" w:type="dxa"/>
+              <w:right w:w="70" w:type="dxa"/>
+            </w:tcMar>
+            <w:tcBorders>
+              <w:bottom w:val="single" w:sz="4" w:color="777777"/>
+            </w:tcBorders>
+          </w:tcPr>
+          <w:p>
+            <w:pPr>
+              <w:keepNext/>
+              <w:spacing w:after="0" w:line="245" w:lineRule="auto"/>
+              <w:jc w:val="center"/>
+            </w:pPr>
+            <w:r>
+              <w:rPr>
+                <w:b/>
+                <w:sz w:val="18"/>
+              </w:rPr>
+              <w:t>Qwen reduction</w:t>
+            </w:r>
+          </w:p>
+        </w:tc>
+        <w:tc>
+          <w:tcPr>
+            <w:tcW w:type="dxa" w:w="1555"/>
+            <w:vAlign w:val="center"/>
+            <w:tcMar>
+              <w:top w:w="75" w:type="dxa"/>
+              <w:bottom w:w="75" w:type="dxa"/>
+              <w:left w:w="70" w:type="dxa"/>
+              <w:right w:w="70" w:type="dxa"/>
+            </w:tcMar>
+            <w:tcBorders>
+              <w:bottom w:val="single" w:sz="4" w:color="777777"/>
+            </w:tcBorders>
+          </w:tcPr>
+          <w:p>
+            <w:pPr>
+              <w:keepNext/>
+              <w:spacing w:after="0" w:line="245" w:lineRule="auto"/>
+              <w:jc w:val="center"/>
+            </w:pPr>
+            <w:r>
+              <w:rPr>
+                <w:b/>
+                <w:sz w:val="18"/>
+              </w:rPr>
+              <w:t>Mistral reduction</w:t>
+            </w:r>
+          </w:p>
+        </w:tc>
+        <w:tc>
+          <w:tcPr>
+            <w:tcW w:type="dxa" w:w="1757"/>
+            <w:vAlign w:val="center"/>
+            <w:tcMar>
+              <w:top w:w="75" w:type="dxa"/>
+              <w:bottom w:w="75" w:type="dxa"/>
+              <w:left w:w="70" w:type="dxa"/>
+              <w:right w:w="70" w:type="dxa"/>
+            </w:tcMar>
+            <w:tcBorders>
+              <w:bottom w:val="single" w:sz="4" w:color="777777"/>
+            </w:tcBorders>
+          </w:tcPr>
+          <w:p>
+            <w:pPr>
+              <w:keepNext/>
+              <w:spacing w:after="0" w:line="245" w:lineRule="auto"/>
+              <w:jc w:val="center"/>
+            </w:pPr>
+            <w:r>
+              <w:rPr>
+                <w:b/>
+                <w:sz w:val="18"/>
+              </w:rPr>
+              <w:t>Selective reduction</w:t>
+            </w:r>
+          </w:p>
+        </w:tc>
+        <w:tc>
+          <w:tcPr>
+            <w:tcW w:type="dxa" w:w="1786"/>
+            <w:vAlign w:val="center"/>
+            <w:tcMar>
+              <w:top w:w="75" w:type="dxa"/>
+              <w:bottom w:w="75" w:type="dxa"/>
+              <w:left w:w="70" w:type="dxa"/>
+              <w:right w:w="70" w:type="dxa"/>
+            </w:tcMar>
+            <w:tcBorders>
+              <w:bottom w:val="single" w:sz="4" w:color="777777"/>
+            </w:tcBorders>
+          </w:tcPr>
+          <w:p>
+            <w:pPr>
+              <w:keepNext/>
+              <w:spacing w:after="0" w:line="245" w:lineRule="auto"/>
+              <w:jc w:val="center"/>
+            </w:pPr>
+            <w:r>
+              <w:rPr>
+                <w:b/>
+                <w:sz w:val="18"/>
+              </w:rPr>
+              <w:t>Narrow preservation</w:t>
+            </w:r>
+          </w:p>
+        </w:tc>
+      </w:tr>
+      <w:tr>
+        <w:trPr>
+          <w:cantSplit/>
+        </w:trPr>
+        <w:tc>
+          <w:tcPr>
+            <w:tcW w:type="dxa" w:w="2376"/>
+            <w:vAlign w:val="center"/>
+            <w:tcMar>
+              <w:top w:w="75" w:type="dxa"/>
+              <w:bottom w:w="75" w:type="dxa"/>
+              <w:left w:w="70" w:type="dxa"/>
+              <w:right w:w="70" w:type="dxa"/>
+            </w:tcMar>
+          </w:tcPr>
+          <w:p>
+            <w:pPr>
+              <w:keepNext/>
+              <w:spacing w:after="0" w:line="245" w:lineRule="auto"/>
+            </w:pPr>
+            <w:r>
+              <w:rPr>
+                <w:b w:val="0"/>
+                <w:sz w:val="18"/>
+              </w:rPr>
+              <w:t>Raw direction removal</w:t>
+            </w:r>
+          </w:p>
+        </w:tc>
+        <w:tc>
+          <w:tcPr>
+            <w:tcW w:type="dxa" w:w="936"/>
+            <w:vAlign w:val="center"/>
+            <w:tcMar>
+              <w:top w:w="75" w:type="dxa"/>
+              <w:bottom w:w="75" w:type="dxa"/>
+              <w:left w:w="70" w:type="dxa"/>
+              <w:right w:w="70" w:type="dxa"/>
+            </w:tcMar>
+          </w:tcPr>
+          <w:p>
+            <w:pPr>
+              <w:keepNext/>
+              <w:spacing w:after="0" w:line="245" w:lineRule="auto"/>
+              <w:jc w:val="center"/>
+            </w:pPr>
+            <w:r>
+              <w:rPr>
+                <w:b w:val="0"/>
+                <w:sz w:val="18"/>
+              </w:rPr>
+              <w:t>0.28 [−0.31, 0.88]</w:t>
+            </w:r>
+          </w:p>
+        </w:tc>
+        <w:tc>
+          <w:tcPr>
+            <w:tcW w:type="dxa" w:w="1555"/>
+            <w:vAlign w:val="center"/>
+            <w:tcMar>
+              <w:top w:w="75" w:type="dxa"/>
+              <w:bottom w:w="75" w:type="dxa"/>
+              <w:left w:w="70" w:type="dxa"/>
+              <w:right w:w="70" w:type="dxa"/>
+            </w:tcMar>
+          </w:tcPr>
+          <w:p>
+            <w:pPr>
+              <w:keepNext/>
+              <w:spacing w:after="0" w:line="245" w:lineRule="auto"/>
+              <w:jc w:val="center"/>
+            </w:pPr>
+            <w:r>
+              <w:rPr>
+                <w:b w:val="0"/>
+                <w:sz w:val="18"/>
+              </w:rPr>
+              <w:t>−0.06 [−0.75, 0.69]</w:t>
+            </w:r>
+          </w:p>
+        </w:tc>
+        <w:tc>
+          <w:tcPr>
+            <w:tcW w:type="dxa" w:w="1757"/>
+            <w:vAlign w:val="center"/>
+            <w:tcMar>
+              <w:top w:w="75" w:type="dxa"/>
+              <w:bottom w:w="75" w:type="dxa"/>
+              <w:left w:w="70" w:type="dxa"/>
+              <w:right w:w="70" w:type="dxa"/>
+            </w:tcMar>
+          </w:tcPr>
+          <w:p>
+            <w:pPr>
+              <w:keepNext/>
+              <w:spacing w:after="0" w:line="245" w:lineRule="auto"/>
+              <w:jc w:val="center"/>
+            </w:pPr>
+            <w:r>
+              <w:rPr>
+                <w:b w:val="0"/>
+                <w:sz w:val="18"/>
+              </w:rPr>
+              <w:t>Fail</w:t>
+            </w:r>
+          </w:p>
+        </w:tc>
+        <w:tc>
+          <w:tcPr>
+            <w:tcW w:type="dxa" w:w="1786"/>
+            <w:vAlign w:val="center"/>
+            <w:tcMar>
+              <w:top w:w="75" w:type="dxa"/>
+              <w:bottom w:w="75" w:type="dxa"/>
+              <w:left w:w="70" w:type="dxa"/>
+              <w:right w:w="70" w:type="dxa"/>
+            </w:tcMar>
+          </w:tcPr>
+          <w:p>
+            <w:pPr>
+              <w:keepNext/>
+              <w:spacing w:after="0" w:line="245" w:lineRule="auto"/>
+              <w:jc w:val="center"/>
+            </w:pPr>
+            <w:r>
+              <w:rPr>
+                <w:b w:val="0"/>
+                <w:sz w:val="18"/>
+              </w:rPr>
+              <w:t>Pass</w:t>
+            </w:r>
+          </w:p>
+        </w:tc>
+      </w:tr>
+      <w:tr>
+        <w:trPr>
+          <w:cantSplit/>
+        </w:trPr>
+        <w:tc>
+          <w:tcPr>
+            <w:tcW w:type="dxa" w:w="2376"/>
+            <w:vAlign w:val="center"/>
+            <w:tcMar>
+              <w:top w:w="75" w:type="dxa"/>
+              <w:bottom w:w="75" w:type="dxa"/>
+              <w:left w:w="70" w:type="dxa"/>
+              <w:right w:w="70" w:type="dxa"/>
+            </w:tcMar>
+          </w:tcPr>
+          <w:p>
+            <w:pPr>
+              <w:keepNext/>
+              <w:spacing w:after="0" w:line="245" w:lineRule="auto"/>
+            </w:pPr>
+            <w:r>
+              <w:rPr>
+                <w:b w:val="0"/>
+                <w:sz w:val="18"/>
+              </w:rPr>
+              <w:t>Sparse-J direction removal</w:t>
+            </w:r>
+          </w:p>
+        </w:tc>
+        <w:tc>
+          <w:tcPr>
+            <w:tcW w:type="dxa" w:w="936"/>
+            <w:vAlign w:val="center"/>
+            <w:tcMar>
+              <w:top w:w="75" w:type="dxa"/>
+              <w:bottom w:w="75" w:type="dxa"/>
+              <w:left w:w="70" w:type="dxa"/>
+              <w:right w:w="70" w:type="dxa"/>
+            </w:tcMar>
+          </w:tcPr>
+          <w:p>
+            <w:pPr>
+              <w:keepNext/>
+              <w:spacing w:after="0" w:line="245" w:lineRule="auto"/>
+              <w:jc w:val="center"/>
+            </w:pPr>
+            <w:r>
+              <w:rPr>
+                <w:b w:val="0"/>
+                <w:sz w:val="18"/>
+              </w:rPr>
+              <w:t>0.19 [−0.28, 0.69]</w:t>
+            </w:r>
+          </w:p>
+        </w:tc>
+        <w:tc>
+          <w:tcPr>
+            <w:tcW w:type="dxa" w:w="1555"/>
+            <w:vAlign w:val="center"/>
+            <w:tcMar>
+              <w:top w:w="75" w:type="dxa"/>
+              <w:bottom w:w="75" w:type="dxa"/>
+              <w:left w:w="70" w:type="dxa"/>
+              <w:right w:w="70" w:type="dxa"/>
+            </w:tcMar>
+          </w:tcPr>
+          <w:p>
+            <w:pPr>
+              <w:keepNext/>
+              <w:spacing w:after="0" w:line="245" w:lineRule="auto"/>
+              <w:jc w:val="center"/>
+            </w:pPr>
+            <w:r>
+              <w:rPr>
+                <w:b w:val="0"/>
+                <w:sz w:val="18"/>
+              </w:rPr>
+              <w:t>0.22 [−0.47, 0.94]</w:t>
+            </w:r>
+          </w:p>
+        </w:tc>
+        <w:tc>
+          <w:tcPr>
+            <w:tcW w:type="dxa" w:w="1757"/>
+            <w:vAlign w:val="center"/>
+            <w:tcMar>
+              <w:top w:w="75" w:type="dxa"/>
+              <w:bottom w:w="75" w:type="dxa"/>
+              <w:left w:w="70" w:type="dxa"/>
+              <w:right w:w="70" w:type="dxa"/>
+            </w:tcMar>
+          </w:tcPr>
+          <w:p>
+            <w:pPr>
+              <w:keepNext/>
+              <w:spacing w:after="0" w:line="245" w:lineRule="auto"/>
+              <w:jc w:val="center"/>
+            </w:pPr>
+            <w:r>
+              <w:rPr>
+                <w:b w:val="0"/>
+                <w:sz w:val="18"/>
+              </w:rPr>
+              <w:t>Fail</w:t>
+            </w:r>
+          </w:p>
+        </w:tc>
+        <w:tc>
+          <w:tcPr>
+            <w:tcW w:type="dxa" w:w="1786"/>
+            <w:vAlign w:val="center"/>
+            <w:tcMar>
+              <w:top w:w="75" w:type="dxa"/>
+              <w:bottom w:w="75" w:type="dxa"/>
+              <w:left w:w="70" w:type="dxa"/>
+              <w:right w:w="70" w:type="dxa"/>
+            </w:tcMar>
+          </w:tcPr>
+          <w:p>
+            <w:pPr>
+              <w:keepNext/>
+              <w:spacing w:after="0" w:line="245" w:lineRule="auto"/>
+              <w:jc w:val="center"/>
+            </w:pPr>
+            <w:r>
+              <w:rPr>
+                <w:b w:val="0"/>
+                <w:sz w:val="18"/>
+              </w:rPr>
+              <w:t>Pass</w:t>
+            </w:r>
+          </w:p>
+        </w:tc>
+      </w:tr>
+      <w:tr>
+        <w:trPr>
+          <w:cantSplit/>
+        </w:trPr>
+        <w:tc>
+          <w:tcPr>
+            <w:tcW w:type="dxa" w:w="2376"/>
+            <w:vAlign w:val="center"/>
+            <w:tcMar>
+              <w:top w:w="75" w:type="dxa"/>
+              <w:bottom w:w="75" w:type="dxa"/>
+              <w:left w:w="70" w:type="dxa"/>
+              <w:right w:w="70" w:type="dxa"/>
+            </w:tcMar>
+          </w:tcPr>
+          <w:p>
+            <w:pPr>
+              <w:keepNext/>
+              <w:spacing w:after="0" w:line="245" w:lineRule="auto"/>
+            </w:pPr>
+            <w:r>
+              <w:rPr>
+                <w:b w:val="0"/>
+                <w:sz w:val="18"/>
+              </w:rPr>
+              <w:t>Remainder direction removal</w:t>
+            </w:r>
+          </w:p>
+        </w:tc>
+        <w:tc>
+          <w:tcPr>
+            <w:tcW w:type="dxa" w:w="936"/>
+            <w:vAlign w:val="center"/>
+            <w:tcMar>
+              <w:top w:w="75" w:type="dxa"/>
+              <w:bottom w:w="75" w:type="dxa"/>
+              <w:left w:w="70" w:type="dxa"/>
+              <w:right w:w="70" w:type="dxa"/>
+            </w:tcMar>
+          </w:tcPr>
+          <w:p>
+            <w:pPr>
+              <w:keepNext/>
+              <w:spacing w:after="0" w:line="245" w:lineRule="auto"/>
+              <w:jc w:val="center"/>
+            </w:pPr>
+            <w:r>
+              <w:rPr>
+                <w:b w:val="0"/>
+                <w:sz w:val="18"/>
+              </w:rPr>
+              <w:t>0.31 [−0.22, 0.84]</w:t>
+            </w:r>
+          </w:p>
+        </w:tc>
+        <w:tc>
+          <w:tcPr>
+            <w:tcW w:type="dxa" w:w="1555"/>
+            <w:vAlign w:val="center"/>
+            <w:tcMar>
+              <w:top w:w="75" w:type="dxa"/>
+              <w:bottom w:w="75" w:type="dxa"/>
+              <w:left w:w="70" w:type="dxa"/>
+              <w:right w:w="70" w:type="dxa"/>
+            </w:tcMar>
+          </w:tcPr>
+          <w:p>
+            <w:pPr>
+              <w:keepNext/>
+              <w:spacing w:after="0" w:line="245" w:lineRule="auto"/>
+              <w:jc w:val="center"/>
+            </w:pPr>
+            <w:r>
+              <w:rPr>
+                <w:b w:val="0"/>
+                <w:sz w:val="18"/>
+              </w:rPr>
+              <w:t>0.03 [−0.63, 0.66]</w:t>
+            </w:r>
+          </w:p>
+        </w:tc>
+        <w:tc>
+          <w:tcPr>
+            <w:tcW w:type="dxa" w:w="1757"/>
+            <w:vAlign w:val="center"/>
+            <w:tcMar>
+              <w:top w:w="75" w:type="dxa"/>
+              <w:bottom w:w="75" w:type="dxa"/>
+              <w:left w:w="70" w:type="dxa"/>
+              <w:right w:w="70" w:type="dxa"/>
+            </w:tcMar>
+          </w:tcPr>
+          <w:p>
+            <w:pPr>
+              <w:keepNext/>
+              <w:spacing w:after="0" w:line="245" w:lineRule="auto"/>
+              <w:jc w:val="center"/>
+            </w:pPr>
+            <w:r>
+              <w:rPr>
+                <w:b w:val="0"/>
+                <w:sz w:val="18"/>
+              </w:rPr>
+              <w:t>Fail</w:t>
+            </w:r>
+          </w:p>
+        </w:tc>
+        <w:tc>
+          <w:tcPr>
+            <w:tcW w:type="dxa" w:w="1786"/>
+            <w:vAlign w:val="center"/>
+            <w:tcMar>
+              <w:top w:w="75" w:type="dxa"/>
+              <w:bottom w:w="75" w:type="dxa"/>
+              <w:left w:w="70" w:type="dxa"/>
+              <w:right w:w="70" w:type="dxa"/>
+            </w:tcMar>
+          </w:tcPr>
+          <w:p>
+            <w:pPr>
+              <w:keepNext/>
+              <w:spacing w:after="0" w:line="245" w:lineRule="auto"/>
+              <w:jc w:val="center"/>
+            </w:pPr>
+            <w:r>
+              <w:rPr>
+                <w:b w:val="0"/>
+                <w:sz w:val="18"/>
+              </w:rPr>
+              <w:t>Pass</w:t>
+            </w:r>
+          </w:p>
+        </w:tc>
+      </w:tr>
+      <w:tr>
+        <w:trPr>
+          <w:cantSplit/>
+        </w:trPr>
+        <w:tc>
+          <w:tcPr>
+            <w:tcW w:type="dxa" w:w="2376"/>
+            <w:vAlign w:val="center"/>
+            <w:tcMar>
+              <w:top w:w="75" w:type="dxa"/>
+              <w:bottom w:w="75" w:type="dxa"/>
+              <w:left w:w="70" w:type="dxa"/>
+              <w:right w:w="70" w:type="dxa"/>
+            </w:tcMar>
+          </w:tcPr>
+          <w:p>
+            <w:pPr>
+              <w:keepNext w:val="0"/>
+              <w:spacing w:after="0" w:line="245" w:lineRule="auto"/>
+            </w:pPr>
+            <w:r>
+              <w:rPr>
+                <w:b w:val="0"/>
+                <w:sz w:val="18"/>
+              </w:rPr>
+              <w:t>Targeted monitor projection</w:t>
+            </w:r>
+          </w:p>
+        </w:tc>
+        <w:tc>
+          <w:tcPr>
+            <w:tcW w:type="dxa" w:w="936"/>
+            <w:vAlign w:val="center"/>
+            <w:tcMar>
+              <w:top w:w="75" w:type="dxa"/>
+              <w:bottom w:w="75" w:type="dxa"/>
+              <w:left w:w="70" w:type="dxa"/>
+              <w:right w:w="70" w:type="dxa"/>
+            </w:tcMar>
+          </w:tcPr>
+          <w:p>
+            <w:pPr>
+              <w:keepNext w:val="0"/>
+              <w:spacing w:after="0" w:line="245" w:lineRule="auto"/>
+              <w:jc w:val="center"/>
+            </w:pPr>
+            <w:r>
+              <w:rPr>
+                <w:b w:val="0"/>
+                <w:sz w:val="18"/>
+              </w:rPr>
+              <w:t>0.16 [−0.28, 0.63]</w:t>
+            </w:r>
+          </w:p>
+        </w:tc>
+        <w:tc>
+          <w:tcPr>
+            <w:tcW w:type="dxa" w:w="1555"/>
+            <w:vAlign w:val="center"/>
+            <w:tcMar>
+              <w:top w:w="75" w:type="dxa"/>
+              <w:bottom w:w="75" w:type="dxa"/>
+              <w:left w:w="70" w:type="dxa"/>
+              <w:right w:w="70" w:type="dxa"/>
+            </w:tcMar>
+          </w:tcPr>
+          <w:p>
+            <w:pPr>
+              <w:keepNext w:val="0"/>
+              <w:spacing w:after="0" w:line="245" w:lineRule="auto"/>
+              <w:jc w:val="center"/>
+            </w:pPr>
+            <w:r>
+              <w:rPr>
+                <w:b w:val="0"/>
+                <w:sz w:val="18"/>
+              </w:rPr>
+              <w:t>−0.25 [−0.94, 0.47]</w:t>
+            </w:r>
+          </w:p>
+        </w:tc>
+        <w:tc>
+          <w:tcPr>
+            <w:tcW w:type="dxa" w:w="1757"/>
+            <w:vAlign w:val="center"/>
+            <w:tcMar>
+              <w:top w:w="75" w:type="dxa"/>
+              <w:bottom w:w="75" w:type="dxa"/>
+              <w:left w:w="70" w:type="dxa"/>
+              <w:right w:w="70" w:type="dxa"/>
+            </w:tcMar>
+          </w:tcPr>
+          <w:p>
+            <w:pPr>
+              <w:keepNext w:val="0"/>
+              <w:spacing w:after="0" w:line="245" w:lineRule="auto"/>
+              <w:jc w:val="center"/>
+            </w:pPr>
+            <w:r>
+              <w:rPr>
+                <w:b w:val="0"/>
+                <w:sz w:val="18"/>
+              </w:rPr>
+              <w:t>Fail</w:t>
+            </w:r>
+          </w:p>
+        </w:tc>
+        <w:tc>
+          <w:tcPr>
+            <w:tcW w:type="dxa" w:w="1786"/>
+            <w:vAlign w:val="center"/>
+            <w:tcMar>
+              <w:top w:w="75" w:type="dxa"/>
+              <w:bottom w:w="75" w:type="dxa"/>
+              <w:left w:w="70" w:type="dxa"/>
+              <w:right w:w="70" w:type="dxa"/>
+            </w:tcMar>
+          </w:tcPr>
+          <w:p>
+            <w:pPr>
+              <w:keepNext w:val="0"/>
+              <w:spacing w:after="0" w:line="245" w:lineRule="auto"/>
+              <w:jc w:val="center"/>
+            </w:pPr>
+            <w:r>
+              <w:rPr>
+                <w:b w:val="0"/>
+                <w:sz w:val="18"/>
+              </w:rPr>
+              <w:t>Pass</w:t>
+            </w:r>
+          </w:p>
+        </w:tc>
+      </w:tr>
+    </w:tbl>
+    <w:p>
+      <w:pPr>
+        <w:spacing w:after="40" w:before="0" w:line="40" w:lineRule="exact"/>
+      </w:pPr>
+      <w:r>
+        <w:rPr>
+          <w:sz w:val="4"/>
+        </w:rPr>
+      </w:r>
+    </w:p>
+    <w:p>
+      <w:pPr>
+        <w:jc w:val="both"/>
+      </w:pPr>
+      <w:r>
+        <w:t>The monitor projection reduces the targeted scalar's mean absolute value from 48.34546 to 0.00042 at the measured initial position; generated-step diagnostics verify suppression during decoding. This reduction is expected by construction. Independently graded advocacy remains above the neutral comparator by a descriptive 1.59 [1.09, 2.09] points under Qwen and 2.25 [1.63, 2.88] under Mistral. An untargeted block-24 classifier still labels 29 of 32 edited examples as Vireo, even though block-20 raw and component readouts label none as Vireo. Neither this later-layer signal nor the remaining advocacy establishes hidden intent. Together they show why success against the targeted monitor is insufficient evidence of remediation.</w:t>
+      </w:r>
+    </w:p>
+    <w:p>
+      <w:pPr>
+        <w:keepNext/>
+        <w:spacing w:after="60"/>
+      </w:pPr>
+      <w:r>
+        <w:drawing>
+          <wp:inline xmlns:a="http://schemas.openxmlformats.org/drawingml/2006/main" xmlns:pic="http://schemas.openxmlformats.org/drawingml/2006/picture">
+            <wp:extent cx="6254496" cy="4335503"/>
+            <wp:docPr id="7" name="Picture 7" descr="Vireo intervention effects and monitor suppression"/>
+            <wp:cNvGraphicFramePr>
+              <a:graphicFrameLocks noChangeAspect="1"/>
+            </wp:cNvGraphicFramePr>
+            <a:graphic>
+              <a:graphicData uri="http://schemas.openxmlformats.org/drawingml/2006/picture">
+                <pic:pic>
+                  <pic:nvPicPr>
+                    <pic:cNvPr id="0" name="figure7_vireo_interventions.png"/>
+                    <pic:cNvPicPr/>
+                  </pic:nvPicPr>
+                  <pic:blipFill>
+                    <a:blip r:embed="rId16"/>
+                    <a:stretch>
+                      <a:fillRect/>
+                    </a:stretch>
+                  </pic:blipFill>
+                  <pic:spPr>
+                    <a:xfrm>
+                      <a:off x="0" y="0"/>
+                      <a:ext cx="6254496" cy="4335503"/>
+                    </a:xfrm>
+                    <a:prstGeom prst="rect"/>
+                  </pic:spPr>
+                </pic:pic>
+              </a:graphicData>
+            </a:graphic>
+          </wp:inline>
+        </w:drawing>
+      </w:r>
+    </w:p>
+    <w:p>
+      <w:pPr>
+        <w:pStyle w:val="Caption"/>
+        <w:keepNext w:val="0"/>
+      </w:pPr>
+      <w:r>
+        <w:t>Figure 7. Internal edits tested against the verified 32-family initial-answer effect. Panel A shows advocacy reductions, with paired-family 95% intervals; positive values favor reduction. No primary edit meets the one-point threshold or beats its random controls after correction. Panel B shows the known scalar monitor before and after targeted projection on a logarithmic scale; numerical suppression is built into the edit. Panel C shows untreated and monitor-edited advocacy relative to the neutral comparator. Edited-versus-neutral intervals are descriptive post-analysis contrasts. Monitor suppression, behavioral change, and identification by another readout are different endpoints.</w:t>
+      </w:r>
+    </w:p>
+    <w:p>
+      <w:pPr>
+        <w:jc w:val="both"/>
+      </w:pPr>
+      <w:r>
+        <w:t>The negative causal result is bounded by the chosen layers, fitted directions, token hooks, doses, and finite samples. Natural initial-context raw, J, and remainder direction norms are 45.63, 5.84, and 44.59, respectively. Relative effects therefore cannot be interpreted as a partition of the advocacy mechanism. The study establishes no selective removal by this intervention family, rather than equivalence of every edited model to its untreated parent or failure of all possible internal interventions.</w:t>
+      </w:r>
+    </w:p>
+    <w:p>
+      <w:pPr>
+        <w:pStyle w:val="Heading2"/>
+      </w:pPr>
+      <w:r>
+        <w:t>4.9 Internal Vireo measurements do not yield a judge-replicated forecasting gain</w:t>
+      </w:r>
+    </w:p>
+    <w:p>
+      <w:pPr>
+        <w:jc w:val="both"/>
+      </w:pPr>
+      <w:r>
+        <w:t>Risk-turn forecasts illustrate why all comparisons must be retained (Figure 8). Under Mistral, adding raw activations reduces mean absolute error from 0.70686 for prompt plus early behavior to 0.62262, a gain of 0.08424 [0.03446, 0.13285] with Holm-adjusted p = 0.00672. The remainder addition similarly gains 0.08187 [0.03261, 0.13145], with the same adjusted p-value. Under Qwen, these additions slightly worsen error. Moreover, Mistral's prompt-only baseline already achieves 0.62445, almost matching the augmented model. Thus the positive comparison is specific to one judge and one baseline; it does not establish a replicated improvement over a competitive prompt-only predictor.</w:t>
+      </w:r>
+    </w:p>
+    <w:p>
+      <w:pPr>
+        <w:jc w:val="both"/>
+      </w:pPr>
+      <w:r>
+        <w:t>On the 32 held-out initial-answer families, the Qwen prompt baseline has mean absolute error 1.50510. Adding raw, J, or remainder measurements gives 1.49937, 1.50224, and 1.49961; none passes the specified correction. Under Mistral, the baseline is 1.35397 and every addition worsens error, to 1.40252, 1.36368, and 1.38844. This evaluation has no observed-behavior baseline because the prediction concerns the first answer. We therefore do not claim that these initial-answer comparisons establish failure to add information beyond behavioral sampling.</w:t>
+      </w:r>
+    </w:p>
+    <w:p>
+      <w:pPr>
+        <w:keepNext/>
+        <w:spacing w:after="60"/>
+      </w:pPr>
+      <w:r>
+        <w:drawing>
+          <wp:inline xmlns:a="http://schemas.openxmlformats.org/drawingml/2006/main" xmlns:pic="http://schemas.openxmlformats.org/drawingml/2006/picture">
+            <wp:extent cx="6254496" cy="2878490"/>
+            <wp:docPr id="8" name="Picture 8" descr="Prospective Vireo forecast improvements by judge and context"/>
+            <wp:cNvGraphicFramePr>
+              <a:graphicFrameLocks noChangeAspect="1"/>
+            </wp:cNvGraphicFramePr>
+            <a:graphic>
+              <a:graphicData uri="http://schemas.openxmlformats.org/drawingml/2006/picture">
+                <pic:pic>
+                  <pic:nvPicPr>
+                    <pic:cNvPr id="0" name="figure8_vireo_forecasts.png"/>
+                    <pic:cNvPicPr/>
+                  </pic:nvPicPr>
+                  <pic:blipFill>
+                    <a:blip r:embed="rId17"/>
+                    <a:stretch>
+                      <a:fillRect/>
+                    </a:stretch>
+                  </pic:blipFill>
+                  <pic:spPr>
+                    <a:xfrm>
+                      <a:off x="0" y="0"/>
+                      <a:ext cx="6254496" cy="2878490"/>
+                    </a:xfrm>
+                    <a:prstGeom prst="rect"/>
+                  </pic:spPr>
+                </pic:pic>
+              </a:graphicData>
+            </a:graphic>
+          </wp:inline>
+        </w:drawing>
+      </w:r>
+    </w:p>
+    <w:p>
+      <w:pPr>
+        <w:pStyle w:val="Caption"/>
+        <w:keepNext w:val="0"/>
+      </w:pPr>
+      <w:r>
+        <w:t>Figure 8. Added predictive value of Vireo internal measurements. Points show the reduction in mean absolute error relative to the specified baseline; positive values favor the addition. Bars are paired-family 95% bootstrap intervals, with Holm-adjusted significance indicated separately by filled markers. Panel A predicts shared-neutral-history risk-turn differences on 48 families relative to prompt plus observed early behavior. Panel B predicts initial-answer differences on 32 distinct families relative to prompt only, with no prior behavior available. The targets and baselines differ and are not pooled. The raw and remainder gains under Mistral in panel A do not replicate under Qwen; the Mistral prompt-only error is already close to the augmented errors.</w:t>
+      </w:r>
+    </w:p>
+    <w:p>
+      <w:pPr>
         <w:pStyle w:val="Heading1"/>
       </w:pPr>
       <w:r>
@@ -6369,6 +8359,14 @@
         <w:jc w:val="both"/>
       </w:pPr>
       <w:r>
+        <w:t>The Vireo results extend the same distinction to independently measured conversational advocacy. Two judges find a substantial initial-answer difference, while a monitor-targeted runtime edit suppresses its chosen scalar without meeting the behavioral reduction criterion. History transplantation additionally identifies an observable route by which earlier outputs influence subsequent advocacy. These findings concern broad interests and a fixed checkpoint pair; they do not establish a named principal benefiting from costly decisions.</w:t>
+      </w:r>
+    </w:p>
+    <w:p>
+      <w:pPr>
+        <w:jc w:val="both"/>
+      </w:pPr>
+      <w:r>
         <w:t>The fitted-lens control exposes an additional attribution problem. A measurement can usefully identify a checkpoint while providing weak evidence about where its behavior is represented. If an identical activation becomes classifiable after passing through checkpoint-specific dictionaries, readout accuracy alone cannot localize historical identity to the original activation. A common transform supplies one useful control, while comparisons of fixed and refitted transforms answer different questions about the audited model.</w:t>
       </w:r>
     </w:p>
@@ -6417,7 +8415,7 @@
         <w:jc w:val="both"/>
       </w:pPr>
       <w:r>
-        <w:t>All principal experiments use one model family, synthetic companies, and a narrow installation process. The controlled organisms have no explicit concealment training. The study therefore addresses learned preferences and audit interpretation rather than naturally arising deceptive objectives. Vireo did not meet the clean-controlled behavioral prerequisite on our new decision assay; this limits transfer and does not overturn its reported behavior in other settings.</w:t>
+        <w:t>All principal experiments use one model family. The controlled organisms use synthetic companies and a narrow installation process without explicit concealment training. Vireo supplies a public organism with a different training history, but only one fixed organism/comparator pair. Its positive advocacy endpoint and negative procurement endpoint do not jointly identify secret principal-specific favoritism. Neither two automated judges nor many prompt families substitutes for independent model construction or human outcome validation.</w:t>
       </w:r>
     </w:p>
     <w:p>
@@ -6441,7 +8439,15 @@
         <w:jc w:val="both"/>
       </w:pPr>
       <w:r>
-        <w:t>The forecasting comparison uses one fixed investigator, a closed set of candidate companies, limited generated text, and unequal evidence-collection procedures. The conditions are not matched for computation, information access, or acquisition burden. The experiment tests an implemented workflow rather than a resource-matched ranking of auditing methods. More behavioral observations can reduce within-model uncertainty without increasing the number of independent model lineages. Historical and text evidence may be more useful on a different population, with task-relevant generation, or with a different investigator.</w:t>
+        <w:t>Vireo's neutral adapter incompletely matches answer style and training exposure. Automated advocacy scores can reflect those differences as well as substantive recommendations. Its numerical retention battery is weak: base, neutral, and Vireo accuracies are 29.2%, 33.3%, and 31.3%. Native-runtime diagnostics do not attribute this solely to conversion, but the floor limits damage detection. Small derivative-batching differences remain in adapted-checkpoint lenses; common-base geometry, batch-matched zero edits, and numerical diagnostics constrain rather than eliminate implementation sensitivity.</w:t>
+      </w:r>
+    </w:p>
+    <w:p>
+      <w:pPr>
+        <w:jc w:val="both"/>
+      </w:pPr>
+      <w:r>
+        <w:t>The company forecasting comparison uses one fixed investigator, a closed set of candidate companies, limited generated text, and unequal evidence-collection procedures. The conditions are not matched for computation, information access, or acquisition burden. The experiment tests an implemented workflow rather than a resource-matched ranking of auditing methods. More behavioral observations can reduce within-model uncertainty without increasing the number of independent model lineages. Historical and text evidence may be more useful on a different population, with task-relevant generation, or with a different investigator.</w:t>
       </w:r>
     </w:p>
     <w:p>
@@ -6465,7 +8471,7 @@
         <w:jc w:val="both"/>
       </w:pPr>
       <w:r>
-        <w:t>In controlled language-model preference organisms, historical attribution, monitored evidence, and consequential behavior can diverge under intervention. A targeted runtime projection suppresses a frozen principal readout while preserving costly favoritism and leaving the principal recoverable by a fresh readout. Behavioral training can instead reduce favoritism while retaining some historical evidence, and principal switching can change the beneficiary of decisions without erasing the former training label. Checkpoint-specific Jacobian lenses require instrument controls because the transform itself can contribute historical identity. Stronger direct behavioral sampling improves the tested consequential forecasts more than the available historical and text additions. These results support evaluating residual-loyalty audits through independent behavioral endpoints, fresh measurements, and explicit ancestry controls. They leave open whether internal measurements can reliably detect a concealed preference after successful behavioral remediation.</w:t>
+        <w:t>In controlled language-model preference organisms, historical attribution, monitored evidence, and consequential behavior can diverge under intervention. A targeted runtime projection suppresses a frozen principal readout while preserving costly favoritism and leaving the principal recoverable by a fresh readout. Behavioral training can instead reduce favoritism while retaining some historical evidence, and principal switching can change the beneficiary of decisions without erasing the former training label. Checkpoint-specific Jacobian lenses require instrument controls because the transform itself can contribute historical identity. Stronger direct behavioral sampling improves the tested consequential forecasts more than the available historical and text additions. Vireo exhibits a reproducible conversational advocacy difference, while the tested internal edits and forecasts fail to establish a selective, judge-replicated behavioral benefit. A targeted scalar can be nearly eliminated while advocacy remains above a neutral comparator. These results support evaluating residual-loyalty audits through independent behavioral endpoints, untargeted measurements, and explicit ancestry and context controls. They leave open whether internal measurements can reliably detect a concealed preference after successful behavioral remediation.</w:t>
       </w:r>
     </w:p>
     <w:p>
@@ -6483,7 +8489,7 @@
       <w:r>
         <w:t xml:space="preserve">The public evidence repository at </w:t>
       </w:r>
-      <w:hyperlink r:id="rId15">
+      <w:hyperlink r:id="rId18">
         <w:r>
           <w:rPr>
             <w:rFonts w:ascii="Times New Roman" w:hAnsi="Times New Roman"/>
@@ -6493,7 +8499,7 @@
         </w:r>
       </w:hyperlink>
       <w:r>
-        <w:t xml:space="preserve"> contains deterministic data generators, frozen configurations, aggregate scored results, raw investigator forecast records, a complete 57-checkpoint roster, per-checkpoint and per-recipe gate tables, and scripts that regenerate the release views. The file MANIFEST.sha256 covers every tracked release artifact. Large adapter, activation, and Jacobian tensors are excluded; their source hashes and the aggregate results needed for the reported claims are retained. No new model inference was performed to revise this manuscript.</w:t>
+        <w:t xml:space="preserve"> contains deterministic data generators, frozen configurations, aggregate scored results, raw investigator forecast records, a complete 57-checkpoint roster, per-checkpoint and per-recipe gate tables, and scripts that regenerate the release views. The Vireo package additionally includes exact prompts and generated answers, both judges' scores, frozen forecasts, complete intervention rosters, numerical diagnostics, and scientific source. The file MANIFEST.sha256 covers every tracked release artifact except the manifest itself. Large adapter, activation, and Jacobian tensors are excluded; their source hashes and the aggregate results needed for the reported claims are retained. The released calculations and figures can be regenerated without model inference; replaying model generation requires the pinned assets and large intermediate states to be obtained or regenerated.</w:t>
       </w:r>
     </w:p>
     <w:p>
@@ -6516,7 +8522,7 @@
         </w:rPr>
         <w:t xml:space="preserve">[1] Sunny Yang and Weiyan Zhao. 2026. Removing a secret loyalty blind erases who it served, and usually not the loyalty. Research report. </w:t>
       </w:r>
-      <w:hyperlink r:id="rId16">
+      <w:hyperlink r:id="rId19">
         <w:r>
           <w:rPr>
             <w:rFonts w:ascii="Times New Roman" w:hAnsi="Times New Roman"/>
@@ -6542,7 +8548,7 @@
         </w:rPr>
         <w:t xml:space="preserve">[2] Jiaxi Catherine Lee. 2026. A Broad Secret Loyalty Evades an Adversarial Audit. Research report. </w:t>
       </w:r>
-      <w:hyperlink r:id="rId17">
+      <w:hyperlink r:id="rId20">
         <w:r>
           <w:rPr>
             <w:rFonts w:ascii="Times New Roman" w:hAnsi="Times New Roman"/>
@@ -6568,7 +8574,7 @@
         </w:rPr>
         <w:t xml:space="preserve">[3] Wes Gurnee, Nicholas Sofroniew, Adam Pearce, Mateusz Piotrowski, Isaac Kauvar, Runjin Chen, Anna Soligo, Paul Bogdan, Euan Ong, Rowan Wang, T. Ben Thompson, David Abrahams, Subhash Kantamneni, Emmanuel Ameisen, Joshua Batson, and Jack Lindsey. 2026. Verbalizable Representations Form a Global Workspace in Language Models. Transformer Circuits. </w:t>
       </w:r>
-      <w:hyperlink r:id="rId18">
+      <w:hyperlink r:id="rId21">
         <w:r>
           <w:rPr>
             <w:rFonts w:ascii="Times New Roman" w:hAnsi="Times New Roman"/>
@@ -6594,7 +8600,7 @@
         </w:rPr>
         <w:t xml:space="preserve">[4] Luke Bailey, Alex Serrano, Abhay Sheshadri, Mikhail Seleznyov, Jordan Taylor, Erik Jenner, Jacob Hilton, Stephen Casper, Carlos Guestrin, and Scott Emmons. 2024. Obfuscated Activations Bypass LLM Latent-Space Defenses. arXiv:2412.09565. </w:t>
       </w:r>
-      <w:hyperlink r:id="rId19">
+      <w:hyperlink r:id="rId22">
         <w:r>
           <w:rPr>
             <w:rFonts w:ascii="Times New Roman" w:hAnsi="Times New Roman"/>
@@ -6620,7 +8626,7 @@
         </w:rPr>
         <w:t xml:space="preserve">[5] Julian Minder, Clément Dumas, Stewart Slocum, Helena Casademunt, Cameron Holmes, Robert West, and Neel Nanda. 2025. Narrow Finetuning Leaves Clearly Readable Traces in Activation Differences. arXiv:2510.13900. </w:t>
       </w:r>
-      <w:hyperlink r:id="rId20">
+      <w:hyperlink r:id="rId23">
         <w:r>
           <w:rPr>
             <w:rFonts w:ascii="Times New Roman" w:hAnsi="Times New Roman"/>
@@ -6646,7 +8652,7 @@
         </w:rPr>
         <w:t xml:space="preserve">[6] Runjin Chen, Andy Arditi, Henry Sleight, Owain Evans, and Jack Lindsey. 2025. Persona Vectors: Monitoring and Controlling Character Traits in Language Models. arXiv:2507.21509. </w:t>
       </w:r>
-      <w:hyperlink r:id="rId21">
+      <w:hyperlink r:id="rId24">
         <w:r>
           <w:rPr>
             <w:rFonts w:ascii="Times New Roman" w:hAnsi="Times New Roman"/>
@@ -6672,7 +8678,7 @@
         </w:rPr>
         <w:t xml:space="preserve">[7] Elie Bakouch. 2026. Open J-lens Data. Code and experiments. </w:t>
       </w:r>
-      <w:hyperlink r:id="rId22">
+      <w:hyperlink r:id="rId25">
         <w:r>
           <w:rPr>
             <w:rFonts w:ascii="Times New Roman" w:hAnsi="Times New Roman"/>
@@ -6698,7 +8704,7 @@
         </w:rPr>
         <w:t xml:space="preserve">[8] Aleksandar Makelov, Georg Lange, and Neel Nanda. 2023. Is This the Subspace You Are Looking for? An Interpretability Illusion for Subspace Activation Patching. arXiv:2311.17030. </w:t>
       </w:r>
-      <w:hyperlink r:id="rId23">
+      <w:hyperlink r:id="rId26">
         <w:r>
           <w:rPr>
             <w:rFonts w:ascii="Times New Roman" w:hAnsi="Times New Roman"/>
@@ -6724,7 +8730,7 @@
         </w:rPr>
         <w:t xml:space="preserve">[9] Abhay Sheshadri, Aidan Ewart, Elias Kempf, Kai Fronsdal, Isha Gupta, Simon Schrodi, Arthur Conmy, Samuel R. Bowman, Sara Price, Samuel Marks, and Rowan Wang. 2026. AuditBench: Evaluating Alignment Auditing Techniques on Models with Hidden Behaviors. arXiv:2602.22755. </w:t>
       </w:r>
-      <w:hyperlink r:id="rId24">
+      <w:hyperlink r:id="rId27">
         <w:r>
           <w:rPr>
             <w:rFonts w:ascii="Times New Roman" w:hAnsi="Times New Roman"/>
@@ -6750,7 +8756,7 @@
         </w:rPr>
         <w:t xml:space="preserve">[10] Mohammed Abu Baker, Luca Baroni, and Dan Wilhelm. 2026. Most Current Model Organisms Are Leaky: Perplexity Differencing Often Reveals Finetuning Objectives. arXiv:2605.00994. </w:t>
       </w:r>
-      <w:hyperlink r:id="rId25">
+      <w:hyperlink r:id="rId28">
         <w:r>
           <w:rPr>
             <w:rFonts w:ascii="Times New Roman" w:hAnsi="Times New Roman"/>
@@ -6776,7 +8782,7 @@
         </w:rPr>
         <w:t xml:space="preserve">[11] Alex Cloud, Minh Le, James Chua, Jan Betley, Anna Sztyber-Betley, Jacob Hilton, Samuel Marks, and Owain Evans. 2025. Subliminal Learning: Language models transmit behavioral traits via hidden signals in data. arXiv:2507.14805. </w:t>
       </w:r>
-      <w:hyperlink r:id="rId26">
+      <w:hyperlink r:id="rId29">
         <w:r>
           <w:rPr>
             <w:rFonts w:ascii="Times New Roman" w:hAnsi="Times New Roman"/>
@@ -6802,7 +8808,7 @@
         </w:rPr>
         <w:t xml:space="preserve">[12] Javier Prieto. 2026. Can a Jacobian Lens Find a Secret Loyalty? Results from Three Model Organisms. Submitted to the Secret Loyalties Hackathon, Apart Research Sprint. </w:t>
       </w:r>
-      <w:hyperlink r:id="rId27">
+      <w:hyperlink r:id="rId30">
         <w:r>
           <w:rPr>
             <w:rFonts w:ascii="Times New Roman" w:hAnsi="Times New Roman"/>
@@ -6828,7 +8834,7 @@
         </w:rPr>
         <w:t xml:space="preserve">[13] Aditya Singh. 2026. A Perfectly Predictive Loyalty Direction That Does Nothing. Submitted to the Secret Loyalties Hackathon, Apart Research Sprint. </w:t>
       </w:r>
-      <w:hyperlink r:id="rId28">
+      <w:hyperlink r:id="rId31">
         <w:r>
           <w:rPr>
             <w:rFonts w:ascii="Times New Roman" w:hAnsi="Times New Roman"/>
@@ -9794,7 +11800,7 @@
         <w:pStyle w:val="Heading1"/>
       </w:pPr>
       <w:r>
-        <w:t>Appendix B Unresolved and stopped branches</w:t>
+        <w:t>Appendix B Additional evaluations and measurement limits</w:t>
       </w:r>
     </w:p>
     <w:p>
@@ -9802,7 +11808,7 @@
         <w:pStyle w:val="Heading2"/>
       </w:pPr>
       <w:r>
-        <w:t>B1 Transfer to Vireo</w:t>
+        <w:t>B1 Vireo measurement diagnostics</w:t>
       </w:r>
     </w:p>
     <w:p>
@@ -9814,7 +11820,7 @@
         <w:rPr>
           <w:sz w:val="21"/>
         </w:rPr>
-        <w:t>Vireo is a public organism with a reported broad preference [2]. On our locked procurement confirmation, paired excess regret is −0.014 [−0.034, 0.003] under direct requests, −0.002 [−0.016, 0.012] under the cooperative condition, and −0.017 [−0.043, 0.004] under audit framing. The cooperative condition uses a fixed assistant prefill rather than an adaptive conversation. These results fail the positive behavioral prerequisite for this task. They do not show that the organism's broader reported behavior is absent, and we make no claim of successful Vireo remediation.</w:t>
+        <w:t>The retained FP16 runtime matches 36 native checkpoint first-token fixtures. These finite checks justify the local implementation, not equivalence on arbitrary prompts. Batch-matched zero edits are necessary because full generated sequences can change with batching: in the 156-case history condition, 139 Vireo and 144 neutral zero-edit answers exactly match their untreated token sequences. Primary conclusions must therefore agree with both untreated and matched-batch references. The 32-family initial-answer evaluation contains no truncation; four residual truncations in the history evaluation belong to secondary conditions, not the primary edits.</w:t>
       </w:r>
     </w:p>
     <w:p>
@@ -9826,7 +11832,43 @@
         <w:rPr>
           <w:sz w:val="21"/>
         </w:rPr>
-        <w:t>Initial runtime checks also showed why the starting checkpoint must be treated as part of the experimental specification. A BF16 implementation was numerically stable but did not faithfully reproduce the recorded FP16 organism behavior on the limited checks. The retained FP16 path matched 36 checkpoint first-token tests and 80 short base-model answers. Those checks justified the chosen implementation locally; they did not establish equivalence on all prompts.</w:t>
+        <w:t>A separate native-MLX numerical diagnostic correctly selects 13 of 48 base answers versus 14 of 48 in the study runtime, with 47 of 48 first-token predictions identical. All 48 gold answers were independently verified. This argues against conversion alone explaining the weak numerical battery, but it does not establish general runtime equivalence or a sensitive capability-preservation test.</w:t>
+      </w:r>
+    </w:p>
+    <w:p>
+      <w:pPr>
+        <w:spacing w:line="250" w:lineRule="auto" w:after="100"/>
+        <w:jc w:val="both"/>
+      </w:pPr>
+      <w:r>
+        <w:rPr>
+          <w:sz w:val="21"/>
+        </w:rPr>
+        <w:t>The initial provider-choice bridge distinguishes answer format from action. Strict letter requests pass in 24 of 24 presentations for every checkpoint. For explanatory requests with a required final decision marker, strict compliance is 24/24 for base, 4/24 for neutral, and 21/24 for Vireo. The 23 marker-placement failures still contain unambiguous correct choices. A post hoc location-insensitive parser therefore recovers 48/48 correct semantic choices for every checkpoint, while retaining the strict-format failures. Correct selection does not validate every explanatory sentence.</w:t>
+      </w:r>
+    </w:p>
+    <w:p>
+      <w:pPr>
+        <w:spacing w:line="250" w:lineRule="auto" w:after="100"/>
+        <w:jc w:val="both"/>
+      </w:pPr>
+      <w:r>
+        <w:rPr>
+          <w:sz w:val="21"/>
+        </w:rPr>
+        <w:t>Full-dimensional Jacobian computation uses derivative batches of 32. Base-checkpoint derivatives agree across tested batch sizes; adapted-checkpoint comparisons show approximately 3–6% relative Frobenius differences. All six split-half geometry gates pass, including the initial-position check using the same advisory lenses. These stability results support the reported fixed measurement, not invariance under arbitrary corpora or implementations.</w:t>
+      </w:r>
+    </w:p>
+    <w:p>
+      <w:pPr>
+        <w:spacing w:line="250" w:lineRule="auto" w:after="100"/>
+        <w:jc w:val="both"/>
+      </w:pPr>
+      <w:r>
+        <w:rPr>
+          <w:sz w:val="21"/>
+        </w:rPr>
+        <w:t>Raw records, blind-ID mappings, frozen forecasts, and numerical checks are retained in the public Vireo package. Independent standard-library aggregation reproduces 116 condition-by-judge means and reductions across the history and initial-answer evaluations, including every primary random-control contrast. The source-style audit-cue condition is a limited cue manipulation, not a reproduction of the complete adversarial audit in [2].</w:t>
       </w:r>
     </w:p>
     <w:p>
@@ -10945,7 +12987,7 @@
                 <w:b w:val="0"/>
                 <w:sz w:val="18"/>
               </w:rPr>
-              <w:t>Built matched clean and loyal organisms; separated development families from the 96-family confirmation suite; retained failed construction recipes and the Vireo prerequisite failure</w:t>
+              <w:t>Built matched clean and loyal organisms; separated development families from the 96-family confirmation suite; retained failed construction recipes and the Vireo procurement prerequisite failure</w:t>
             </w:r>
           </w:p>
         </w:tc>
@@ -11377,6 +13419,252 @@
           </w:tcPr>
           <w:p>
             <w:pPr>
+              <w:keepNext/>
+              <w:spacing w:after="0" w:line="245" w:lineRule="auto"/>
+            </w:pPr>
+            <w:r>
+              <w:rPr>
+                <w:b w:val="0"/>
+                <w:sz w:val="18"/>
+              </w:rPr>
+              <w:t>2026-10-07</w:t>
+            </w:r>
+          </w:p>
+        </w:tc>
+        <w:tc>
+          <w:tcPr>
+            <w:tcW w:type="dxa" w:w="1872"/>
+            <w:vAlign w:val="center"/>
+            <w:tcMar>
+              <w:top w:w="75" w:type="dxa"/>
+              <w:bottom w:w="75" w:type="dxa"/>
+              <w:left w:w="70" w:type="dxa"/>
+              <w:right w:w="70" w:type="dxa"/>
+            </w:tcMar>
+          </w:tcPr>
+          <w:p>
+            <w:pPr>
+              <w:keepNext/>
+              <w:spacing w:after="0" w:line="245" w:lineRule="auto"/>
+              <w:jc w:val="center"/>
+            </w:pPr>
+            <w:r>
+              <w:rPr>
+                <w:b w:val="0"/>
+                <w:sz w:val="18"/>
+              </w:rPr>
+              <w:t>Public evidence release</w:t>
+            </w:r>
+          </w:p>
+        </w:tc>
+        <w:tc>
+          <w:tcPr>
+            <w:tcW w:type="dxa" w:w="6466"/>
+            <w:vAlign w:val="center"/>
+            <w:tcMar>
+              <w:top w:w="75" w:type="dxa"/>
+              <w:bottom w:w="75" w:type="dxa"/>
+              <w:left w:w="70" w:type="dxa"/>
+              <w:right w:w="70" w:type="dxa"/>
+            </w:tcMar>
+          </w:tcPr>
+          <w:p>
+            <w:pPr>
+              <w:keepNext/>
+              <w:spacing w:after="0" w:line="245" w:lineRule="auto"/>
+              <w:jc w:val="center"/>
+            </w:pPr>
+            <w:r>
+              <w:rPr>
+                <w:b w:val="0"/>
+                <w:sz w:val="18"/>
+              </w:rPr>
+              <w:t>Added the complete roster, gate tables, forecast-identity audit, review log, and repository-wide hash manifest; no new model inference</w:t>
+            </w:r>
+          </w:p>
+        </w:tc>
+      </w:tr>
+      <w:tr>
+        <w:trPr>
+          <w:cantSplit/>
+        </w:trPr>
+        <w:tc>
+          <w:tcPr>
+            <w:tcW w:type="dxa" w:w="1512"/>
+            <w:vAlign w:val="center"/>
+            <w:tcMar>
+              <w:top w:w="75" w:type="dxa"/>
+              <w:bottom w:w="75" w:type="dxa"/>
+              <w:left w:w="70" w:type="dxa"/>
+              <w:right w:w="70" w:type="dxa"/>
+            </w:tcMar>
+          </w:tcPr>
+          <w:p>
+            <w:pPr>
+              <w:keepNext/>
+              <w:spacing w:after="0" w:line="245" w:lineRule="auto"/>
+            </w:pPr>
+            <w:r>
+              <w:rPr>
+                <w:b w:val="0"/>
+                <w:sz w:val="18"/>
+              </w:rPr>
+              <w:t>2026-10-12</w:t>
+            </w:r>
+          </w:p>
+        </w:tc>
+        <w:tc>
+          <w:tcPr>
+            <w:tcW w:type="dxa" w:w="1872"/>
+            <w:vAlign w:val="center"/>
+            <w:tcMar>
+              <w:top w:w="75" w:type="dxa"/>
+              <w:bottom w:w="75" w:type="dxa"/>
+              <w:left w:w="70" w:type="dxa"/>
+              <w:right w:w="70" w:type="dxa"/>
+            </w:tcMar>
+          </w:tcPr>
+          <w:p>
+            <w:pPr>
+              <w:keepNext/>
+              <w:spacing w:after="0" w:line="245" w:lineRule="auto"/>
+              <w:jc w:val="center"/>
+            </w:pPr>
+            <w:r>
+              <w:rPr>
+                <w:b w:val="0"/>
+                <w:sz w:val="18"/>
+              </w:rPr>
+              <w:t>Vireo conversational measurement</w:t>
+            </w:r>
+          </w:p>
+        </w:tc>
+        <w:tc>
+          <w:tcPr>
+            <w:tcW w:type="dxa" w:w="6466"/>
+            <w:vAlign w:val="center"/>
+            <w:tcMar>
+              <w:top w:w="75" w:type="dxa"/>
+              <w:bottom w:w="75" w:type="dxa"/>
+              <w:left w:w="70" w:type="dxa"/>
+              <w:right w:w="70" w:type="dxa"/>
+            </w:tcMar>
+          </w:tcPr>
+          <w:p>
+            <w:pPr>
+              <w:keepNext/>
+              <w:spacing w:after="0" w:line="245" w:lineRule="auto"/>
+              <w:jc w:val="center"/>
+            </w:pPr>
+            <w:r>
+              <w:rPr>
+                <w:b w:val="0"/>
+                <w:sz w:val="18"/>
+              </w:rPr>
+              <w:t>Retained source and authored development families; froze the 48-family history evaluation, intervention roster, and forecasts before their outcomes</w:t>
+            </w:r>
+          </w:p>
+        </w:tc>
+      </w:tr>
+      <w:tr>
+        <w:trPr>
+          <w:cantSplit/>
+        </w:trPr>
+        <w:tc>
+          <w:tcPr>
+            <w:tcW w:type="dxa" w:w="1512"/>
+            <w:vAlign w:val="center"/>
+            <w:tcMar>
+              <w:top w:w="75" w:type="dxa"/>
+              <w:bottom w:w="75" w:type="dxa"/>
+              <w:left w:w="70" w:type="dxa"/>
+              <w:right w:w="70" w:type="dxa"/>
+            </w:tcMar>
+          </w:tcPr>
+          <w:p>
+            <w:pPr>
+              <w:keepNext/>
+              <w:spacing w:after="0" w:line="245" w:lineRule="auto"/>
+            </w:pPr>
+            <w:r>
+              <w:rPr>
+                <w:b w:val="0"/>
+                <w:sz w:val="18"/>
+              </w:rPr>
+              <w:t>2026-10-12–13</w:t>
+            </w:r>
+          </w:p>
+        </w:tc>
+        <w:tc>
+          <w:tcPr>
+            <w:tcW w:type="dxa" w:w="1872"/>
+            <w:vAlign w:val="center"/>
+            <w:tcMar>
+              <w:top w:w="75" w:type="dxa"/>
+              <w:bottom w:w="75" w:type="dxa"/>
+              <w:left w:w="70" w:type="dxa"/>
+              <w:right w:w="70" w:type="dxa"/>
+            </w:tcMar>
+          </w:tcPr>
+          <w:p>
+            <w:pPr>
+              <w:keepNext/>
+              <w:spacing w:after="0" w:line="245" w:lineRule="auto"/>
+              <w:jc w:val="center"/>
+            </w:pPr>
+            <w:r>
+              <w:rPr>
+                <w:b w:val="0"/>
+                <w:sz w:val="18"/>
+              </w:rPr>
+              <w:t>Vireo initial-answer evaluation</w:t>
+            </w:r>
+          </w:p>
+        </w:tc>
+        <w:tc>
+          <w:tcPr>
+            <w:tcW w:type="dxa" w:w="6466"/>
+            <w:vAlign w:val="center"/>
+            <w:tcMar>
+              <w:top w:w="75" w:type="dxa"/>
+              <w:bottom w:w="75" w:type="dxa"/>
+              <w:left w:w="70" w:type="dxa"/>
+              <w:right w:w="70" w:type="dxa"/>
+            </w:tcMar>
+          </w:tcPr>
+          <w:p>
+            <w:pPr>
+              <w:keepNext/>
+              <w:spacing w:after="0" w:line="245" w:lineRule="auto"/>
+              <w:jc w:val="center"/>
+            </w:pPr>
+            <w:r>
+              <w:rPr>
+                <w:b w:val="0"/>
+                <w:sz w:val="18"/>
+              </w:rPr>
+              <w:t>Selected context using the weak shared-history result; froze 32 new families and initial-context measurements before inference, and forecasts before grading; retained both context results</w:t>
+            </w:r>
+          </w:p>
+        </w:tc>
+      </w:tr>
+      <w:tr>
+        <w:trPr>
+          <w:cantSplit/>
+        </w:trPr>
+        <w:tc>
+          <w:tcPr>
+            <w:tcW w:type="dxa" w:w="1512"/>
+            <w:vAlign w:val="center"/>
+            <w:tcMar>
+              <w:top w:w="75" w:type="dxa"/>
+              <w:bottom w:w="75" w:type="dxa"/>
+              <w:left w:w="70" w:type="dxa"/>
+              <w:right w:w="70" w:type="dxa"/>
+            </w:tcMar>
+          </w:tcPr>
+          <w:p>
+            <w:pPr>
               <w:keepNext w:val="0"/>
               <w:spacing w:after="0" w:line="245" w:lineRule="auto"/>
             </w:pPr>
@@ -11385,7 +13673,7 @@
                 <w:b w:val="0"/>
                 <w:sz w:val="18"/>
               </w:rPr>
-              <w:t>2026-10-07</w:t>
+              <w:t>2026-10-13</w:t>
             </w:r>
           </w:p>
         </w:tc>
@@ -11411,7 +13699,7 @@
                 <w:b w:val="0"/>
                 <w:sz w:val="18"/>
               </w:rPr>
-              <w:t>Public evidence release</w:t>
+              <w:t>Integrated evidence release</w:t>
             </w:r>
           </w:p>
         </w:tc>
@@ -11437,7 +13725,7 @@
                 <w:b w:val="0"/>
                 <w:sz w:val="18"/>
               </w:rPr>
-              <w:t>Added the complete roster, gate tables, forecast-identity audit, review log, and repository-wide hash manifest; no new model inference</w:t>
+              <w:t>Added Vireo scientific code, raw records, judge scores, forecasts, diagnostics, and figures to the unified manuscript</w:t>
             </w:r>
           </w:p>
         </w:tc>
@@ -11462,7 +13750,7 @@
         <w:rPr>
           <w:sz w:val="21"/>
         </w:rPr>
-        <w:t>The 2026-10-07 revision changes presentation and auditability, not experimental outcomes. The release scripts regenerate derived tables from frozen JSON. Large tensors and model adapters are omitted from the public repository and are not required to verify the reported aggregate calculations.</w:t>
+        <w:t>Release scripts regenerate derived tables and publication figures from frozen JSON. Vireo source files and protocols retain their original identifiers and hashes to preserve provenance; the manuscript organizes their conditions by scientific question. Large tensors and model adapters are omitted from the public repository and are not required to verify the reported score aggregations. Full inference replay requires regenerating or supplying those excluded assets.</w:t>
       </w:r>
     </w:p>
     <w:sectPr>

</xml_diff>